<commit_message>
Update v4.1.0 user guide
</commit_message>
<xml_diff>
--- a/docs/publications/N0JCG_Scanner_User_Manual.docx
+++ b/docs/publications/N0JCG_Scanner_User_Manual.docx
@@ -187,7 +187,7 @@
                 <w:color w:val="0A1F44"/>
                 <w:sz w:val="21"/>
               </w:rPr>
-              <w:t>3.0.0</w:t>
+              <w:t>4.1.0</w:t>
             </w:r>
           </w:p>
         </w:tc>
@@ -602,6 +602,20 @@
           <w:color w:val="15202B"/>
           <w:sz w:val="21"/>
         </w:rPr>
+        <w:t>Registration and five-minute trial</w:t>
+      </w:r>
+    </w:p>
+    <w:p>
+      <w:pPr>
+        <w:pStyle w:val="ListNumber"/>
+      </w:pPr>
+      <w:r>
+        <w:rPr>
+          <w:rFonts w:ascii="Arial" w:hAnsi="Arial"/>
+          <w:b w:val="0"/>
+          <w:color w:val="15202B"/>
+          <w:sz w:val="21"/>
+        </w:rPr>
         <w:t>Acceptance checklist</w:t>
       </w:r>
     </w:p>
@@ -648,7 +662,7 @@
           <w:color w:val="15202B"/>
           <w:sz w:val="21"/>
         </w:rPr>
-        <w:t>This manual covers the N0JCG Scanner v3.0.0 production layout: P25 trunked radio, FFT-directed VHF and UHF analog scanning, unified browser audio, radio profiles, and four dedicated RTL-SDR receiver assignments. It is written for both initial installation and normal daily operation.</w:t>
+        <w:t>This manual covers the N0JCG Scanner v4.1.0 production layout: P25 trunked radio, FFT-directed VHF and UHF analog scanning, unified browser audio, radio profiles, and four dedicated RTL-SDR receiver assignments. It is written for both initial installation and normal daily operation.</w:t>
       </w:r>
     </w:p>
     <w:p>
@@ -1763,7 +1777,7 @@
           <w:color w:val="2B3440"/>
           <w:sz w:val="16"/>
         </w:rPr>
-        <w:t>cd /home/pi/PI-P25-SCANNER</w:t>
+        <w:t>cd /home/pi/n0jcg-scanner</w:t>
         <w:br/>
         <w:t>./tools/pi5_p25_op25_install_probe.sh</w:t>
         <w:br/>
@@ -2364,7 +2378,7 @@
           <w:color w:val="2B3440"/>
           <w:sz w:val="16"/>
         </w:rPr>
-        <w:t>cd /home/pi/PI-P25-SCANNER</w:t>
+        <w:t>cd /home/pi/n0jcg-scanner</w:t>
         <w:br/>
         <w:t>./tools/pi5_apply_receiver_serial_map.sh --dry-run</w:t>
       </w:r>
@@ -2432,7 +2446,7 @@
           <w:color w:val="2B3440"/>
           <w:sz w:val="16"/>
         </w:rPr>
-        <w:t>/home/pi/PI-P25-SCANNER/runtime/settings/receiver_roles.json</w:t>
+        <w:t>/home/pi/n0jcg-scanner/runtime/settings/receiver_roles.json</w:t>
       </w:r>
     </w:p>
     <w:p>
@@ -2544,7 +2558,7 @@
           <w:color w:val="2B3440"/>
           <w:sz w:val="16"/>
         </w:rPr>
-        <w:t>/home/pi/PI-SCANNER/runtime/settings/analog_receivers.json</w:t>
+        <w:t>/home/pi/n0jcg-scanner/runtime/settings/analog_receivers.json</w:t>
       </w:r>
     </w:p>
     <w:p>
@@ -2812,7 +2826,7 @@
           <w:color w:val="15202B"/>
           <w:sz w:val="21"/>
         </w:rPr>
-        <w:t>The validated Pi layout uses two application roots:</w:t>
+        <w:t>The validated Pi layout uses one application root:</w:t>
       </w:r>
     </w:p>
     <w:tbl>
@@ -2824,8 +2838,8 @@
         <w:tblInd w:w="120" w:type="dxa"/>
       </w:tblPr>
       <w:tblGrid>
-        <w:gridCol w:w="2870"/>
-        <w:gridCol w:w="6490"/>
+        <w:gridCol w:w="2783"/>
+        <w:gridCol w:w="6577"/>
       </w:tblGrid>
       <w:tr>
         <w:trPr>
@@ -2833,7 +2847,7 @@
         </w:trPr>
         <w:tc>
           <w:tcPr>
-            <w:tcW w:type="dxa" w:w="2870"/>
+            <w:tcW w:type="dxa" w:w="2783"/>
             <w:tcMar>
               <w:top w:w="90" w:type="dxa"/>
               <w:start w:w="120" w:type="dxa"/>
@@ -2861,7 +2875,7 @@
         </w:tc>
         <w:tc>
           <w:tcPr>
-            <w:tcW w:type="dxa" w:w="6490"/>
+            <w:tcW w:type="dxa" w:w="6577"/>
             <w:tcMar>
               <w:top w:w="90" w:type="dxa"/>
               <w:start w:w="120" w:type="dxa"/>
@@ -2894,7 +2908,7 @@
         </w:trPr>
         <w:tc>
           <w:tcPr>
-            <w:tcW w:type="dxa" w:w="2870"/>
+            <w:tcW w:type="dxa" w:w="2783"/>
             <w:tcMar>
               <w:top w:w="90" w:type="dxa"/>
               <w:start w:w="120" w:type="dxa"/>
@@ -2916,13 +2930,13 @@
                 <w:sz w:val="17"/>
                 <w:shd w:fill="EEF5FC"/>
               </w:rPr>
-              <w:t>/home/pi/PI-P25-SCANNER</w:t>
+              <w:t>/home/pi/n0jcg-scanner</w:t>
             </w:r>
           </w:p>
         </w:tc>
         <w:tc>
           <w:tcPr>
-            <w:tcW w:type="dxa" w:w="6490"/>
+            <w:tcW w:type="dxa" w:w="6577"/>
             <w:tcMar>
               <w:top w:w="90" w:type="dxa"/>
               <w:start w:w="120" w:type="dxa"/>
@@ -2943,69 +2957,7 @@
                 <w:color w:val="15202B"/>
                 <w:sz w:val="18"/>
               </w:rPr>
-              <w:t>Web UI, backend, P25 configuration, profiles, receiver registry, and audio arbitrator</w:t>
-            </w:r>
-          </w:p>
-        </w:tc>
-      </w:tr>
-      <w:tr>
-        <w:trPr>
-          <w:cantSplit/>
-        </w:trPr>
-        <w:tc>
-          <w:tcPr>
-            <w:tcW w:type="dxa" w:w="2870"/>
-            <w:tcMar>
-              <w:top w:w="90" w:type="dxa"/>
-              <w:start w:w="120" w:type="dxa"/>
-              <w:bottom w:w="90" w:type="dxa"/>
-              <w:end w:w="120" w:type="dxa"/>
-            </w:tcMar>
-            <w:vAlign w:val="center"/>
-            <w:shd w:fill="F8FAFC"/>
-          </w:tcPr>
-          <w:p>
-            <w:pPr>
-              <w:spacing w:after="0"/>
-            </w:pPr>
-            <w:r/>
-            <w:r>
-              <w:rPr>
-                <w:rFonts w:ascii="Consolas" w:hAnsi="Consolas"/>
-                <w:b w:val="0"/>
-                <w:color w:val="0A1F44"/>
-                <w:sz w:val="17"/>
-                <w:shd w:fill="EEF5FC"/>
-              </w:rPr>
-              <w:t>/home/pi/PI-SCANNER</w:t>
-            </w:r>
-          </w:p>
-        </w:tc>
-        <w:tc>
-          <w:tcPr>
-            <w:tcW w:type="dxa" w:w="6490"/>
-            <w:tcMar>
-              <w:top w:w="90" w:type="dxa"/>
-              <w:start w:w="120" w:type="dxa"/>
-              <w:bottom w:w="90" w:type="dxa"/>
-              <w:end w:w="120" w:type="dxa"/>
-            </w:tcMar>
-            <w:vAlign w:val="center"/>
-            <w:shd w:fill="F8FAFC"/>
-          </w:tcPr>
-          <w:p>
-            <w:pPr>
-              <w:spacing w:after="0"/>
-            </w:pPr>
-            <w:r/>
-            <w:r>
-              <w:rPr>
-                <w:rFonts w:ascii="Arial" w:hAnsi="Arial"/>
-                <w:b w:val="0"/>
-                <w:color w:val="15202B"/>
-                <w:sz w:val="18"/>
-              </w:rPr>
-              <w:t>VHF/UHF workers, analog configuration, controls, status, and captured last-call diagnostics</w:t>
+              <w:t>Complete web UI, backend, P25 and analog configuration, profiles, receiver registry, workers, audio arbitrator, controls, and runtime diagnostics</w:t>
             </w:r>
           </w:p>
         </w:tc>
@@ -3476,7 +3428,7 @@
           <w:color w:val="15202B"/>
           <w:sz w:val="21"/>
         </w:rPr>
-        <w:t>Install or refresh the analog/audio runtime units from the analog root:</w:t>
+        <w:t>Install or refresh the complete audio/runtime units from the application root:</w:t>
       </w:r>
     </w:p>
     <w:p>
@@ -3495,7 +3447,7 @@
           <w:color w:val="2B3440"/>
           <w:sz w:val="16"/>
         </w:rPr>
-        <w:t>cd /home/pi/PI-SCANNER</w:t>
+        <w:t>cd /home/pi/n0jcg-scanner</w:t>
         <w:br/>
         <w:t>sudo ./tools/install_audio_runtime_units.sh</w:t>
       </w:r>
@@ -3528,7 +3480,7 @@
           <w:color w:val="15202B"/>
           <w:sz w:val="21"/>
         </w:rPr>
-        <w:t xml:space="preserve">The production installation uses two hosts. The radio Pi at </w:t>
+        <w:t xml:space="preserve">The radio Pi at </w:t>
       </w:r>
       <w:r>
         <w:rPr>
@@ -3547,7 +3499,7 @@
           <w:color w:val="15202B"/>
           <w:sz w:val="21"/>
         </w:rPr>
-        <w:t xml:space="preserve"> runs the backend, audio infrastructure, OP25, and analog workers. The N0JCG ROC at </w:t>
+        <w:t xml:space="preserve"> runs the complete scanner application: web UI, backend, audio infrastructure, OP25, and analog workers. The N0JCG ROC at </w:t>
       </w:r>
       <w:r>
         <w:rPr>
@@ -3566,7 +3518,7 @@
           <w:color w:val="15202B"/>
           <w:sz w:val="21"/>
         </w:rPr>
-        <w:t xml:space="preserve"> serves the scanner at </w:t>
+        <w:t xml:space="preserve"> remains a separate platform dashboard and provides a direct link to the Pi scanner on port </w:t>
       </w:r>
       <w:r>
         <w:rPr>
@@ -3576,16 +3528,16 @@
           <w:sz w:val="20"/>
           <w:shd w:fill="EEF5FC"/>
         </w:rPr>
-        <w:t>/pi-scanner/</w:t>
-      </w:r>
-      <w:r>
-        <w:rPr>
-          <w:rFonts w:ascii="Arial" w:hAnsi="Arial"/>
-          <w:b w:val="0"/>
-          <w:color w:val="15202B"/>
-          <w:sz w:val="21"/>
-        </w:rPr>
-        <w:t xml:space="preserve"> and forwards its API and audio requests to the radio Pi.</w:t>
+        <w:t>8070</w:t>
+      </w:r>
+      <w:r>
+        <w:rPr>
+          <w:rFonts w:ascii="Arial" w:hAnsi="Arial"/>
+          <w:b w:val="0"/>
+          <w:color w:val="15202B"/>
+          <w:sz w:val="21"/>
+        </w:rPr>
+        <w:t>; it does not host or proxy scanner files.</w:t>
       </w:r>
     </w:p>
     <w:p>
@@ -3659,7 +3611,7 @@
           <w:color w:val="15202B"/>
           <w:sz w:val="21"/>
         </w:rPr>
-        <w:t xml:space="preserve"> owns the dashboard and scanner mount. PI-SCANNER does not install a second ROC web service.</w:t>
+        <w:t xml:space="preserve"> owns only the dashboard. It does not host or proxy scanner assets.</w:t>
       </w:r>
     </w:p>
     <w:p>
@@ -3692,7 +3644,7 @@
           <w:color w:val="2B3440"/>
           <w:sz w:val="16"/>
         </w:rPr>
-        <w:t>http://&lt;ROC_HOST&gt;:8095/pi-scanner/</w:t>
+        <w:t>http://&lt;RADIO_HOST&gt;:8070/</w:t>
       </w:r>
     </w:p>
     <w:p>
@@ -3706,26 +3658,7 @@
           <w:color w:val="15202B"/>
           <w:sz w:val="21"/>
         </w:rPr>
-        <w:t xml:space="preserve">The ROC and radio Pi should both have DHCP reservations. Direct access to </w:t>
-      </w:r>
-      <w:r>
-        <w:rPr>
-          <w:rFonts w:ascii="Consolas" w:hAnsi="Consolas"/>
-          <w:b w:val="0"/>
-          <w:color w:val="0A1F44"/>
-          <w:sz w:val="20"/>
-          <w:shd w:fill="EEF5FC"/>
-        </w:rPr>
-        <w:t>http://&lt;RADIO_HOST&gt;:8070</w:t>
-      </w:r>
-      <w:r>
-        <w:rPr>
-          <w:rFonts w:ascii="Arial" w:hAnsi="Arial"/>
-          <w:b w:val="0"/>
-          <w:color w:val="15202B"/>
-          <w:sz w:val="21"/>
-        </w:rPr>
-        <w:t xml:space="preserve"> is reserved for radio-node maintenance.</w:t>
+        <w:t>The ROC and radio Pi should both have DHCP reservations. The direct Pi URL is the normal scanner operator URL.</w:t>
       </w:r>
     </w:p>
     <w:p>
@@ -3758,7 +3691,7 @@
           <w:color w:val="2B3440"/>
           <w:sz w:val="16"/>
         </w:rPr>
-        <w:t>http://&lt;ROC_HOST&gt;:8095/pi-scanner/mobile.html</w:t>
+        <w:t>http://&lt;RADIO_HOST&gt;:8070/mobile.html</w:t>
       </w:r>
     </w:p>
     <w:p>
@@ -4018,7 +3951,7 @@
           <w:color w:val="15202B"/>
           <w:sz w:val="21"/>
         </w:rPr>
-        <w:t xml:space="preserve"> the browser can reach the ROC and the proxied radio API.</w:t>
+        <w:t xml:space="preserve"> the browser can reach the Pi scanner API and audio services.</w:t>
       </w:r>
     </w:p>
     <w:p>
@@ -4041,7 +3974,7 @@
           <w:color w:val="15202B"/>
           <w:sz w:val="21"/>
         </w:rPr>
-        <w:t xml:space="preserve"> check the ROC application service, then its connection to the radio Pi.</w:t>
+        <w:t xml:space="preserve"> check the Pi scanner service and the network path to the radio Pi. The ROC dashboard is not required for direct Pi operation.</w:t>
       </w:r>
     </w:p>
     <w:p>
@@ -4792,7 +4725,7 @@
           <w:color w:val="2B3440"/>
           <w:sz w:val="16"/>
         </w:rPr>
-        <w:t>/home/pi/PI-SCANNER/runtime/settings/analog_controls.json</w:t>
+        <w:t>/home/pi/n0jcg-scanner/runtime/settings/analog_controls.json</w:t>
       </w:r>
     </w:p>
     <w:p>
@@ -7634,9 +7567,7 @@
           <w:color w:val="2B3440"/>
           <w:sz w:val="16"/>
         </w:rPr>
-        <w:t>/home/pi/PI-P25-SCANNER/runtime/settings/</w:t>
-        <w:br/>
-        <w:t>/home/pi/PI-SCANNER/runtime/settings/</w:t>
+        <w:t>/home/pi/n0jcg-scanner/runtime/settings/</w:t>
       </w:r>
     </w:p>
     <w:p>
@@ -7673,13 +7604,9 @@
         <w:br/>
         <w:t>mkdir -p "/home/pi/scanner-backups/$stamp"</w:t>
         <w:br/>
-        <w:t>cp -a /home/pi/PI-P25-SCANNER/runtime/settings \</w:t>
+        <w:t>cp -a /home/pi/n0jcg-scanner/runtime/settings \</w:t>
         <w:br/>
-        <w:t xml:space="preserve">  "/home/pi/scanner-backups/$stamp/p25-settings"</w:t>
-        <w:br/>
-        <w:t>cp -a /home/pi/PI-SCANNER/runtime/settings \</w:t>
-        <w:br/>
-        <w:t xml:space="preserve">  "/home/pi/scanner-backups/$stamp/analog-settings"</w:t>
+        <w:t xml:space="preserve">  "/home/pi/scanner-backups/$stamp/settings"</w:t>
       </w:r>
     </w:p>
     <w:p>
@@ -7693,7 +7620,7 @@
           <w:color w:val="15202B"/>
           <w:sz w:val="21"/>
         </w:rPr>
-        <w:t>Named profiles are under the P25 runtime settings directory. Analog channel lists, skips, and blocks are under the analog runtime settings directory.</w:t>
+        <w:t>Named profiles, P25 settings, analog channel lists, skips, and blocks are all under the application runtime settings directory.</w:t>
       </w:r>
     </w:p>
     <w:p>
@@ -9868,7 +9795,7 @@
                 <w:sz w:val="17"/>
                 <w:shd w:fill="EEF5FC"/>
               </w:rPr>
-              <w:t>/home/pi/PI-P25-SCANNER/runtime/settings/p25_systems.json</w:t>
+              <w:t>/home/pi/n0jcg-scanner/runtime/settings/p25_systems.json</w:t>
             </w:r>
           </w:p>
         </w:tc>
@@ -9929,7 +9856,7 @@
                 <w:sz w:val="17"/>
                 <w:shd w:fill="EEF5FC"/>
               </w:rPr>
-              <w:t>/home/pi/PI-P25-SCANNER/runtime/settings/receiver_roles.json</w:t>
+              <w:t>/home/pi/n0jcg-scanner/runtime/settings/receiver_roles.json</w:t>
             </w:r>
           </w:p>
         </w:tc>
@@ -9990,7 +9917,7 @@
                 <w:sz w:val="17"/>
                 <w:shd w:fill="EEF5FC"/>
               </w:rPr>
-              <w:t>/home/pi/PI-P25-SCANNER/runtime/settings/configs/</w:t>
+              <w:t>/home/pi/n0jcg-scanner/runtime/settings/configs/</w:t>
             </w:r>
           </w:p>
         </w:tc>
@@ -10051,7 +9978,7 @@
                 <w:sz w:val="17"/>
                 <w:shd w:fill="EEF5FC"/>
               </w:rPr>
-              <w:t>/home/pi/PI-P25-SCANNER/runtime/settings/runtime_activity.json</w:t>
+              <w:t>/home/pi/n0jcg-scanner/runtime/settings/runtime_activity.json</w:t>
             </w:r>
           </w:p>
         </w:tc>
@@ -10112,7 +10039,7 @@
                 <w:sz w:val="17"/>
                 <w:shd w:fill="EEF5FC"/>
               </w:rPr>
-              <w:t>/home/pi/PI-SCANNER/runtime/settings/analog_receivers.json</w:t>
+              <w:t>/home/pi/n0jcg-scanner/runtime/settings/analog_receivers.json</w:t>
             </w:r>
           </w:p>
         </w:tc>
@@ -10173,7 +10100,7 @@
                 <w:sz w:val="17"/>
                 <w:shd w:fill="EEF5FC"/>
               </w:rPr>
-              <w:t>/home/pi/PI-SCANNER/runtime/settings/analog_controls.json</w:t>
+              <w:t>/home/pi/n0jcg-scanner/runtime/settings/analog_controls.json</w:t>
             </w:r>
           </w:p>
         </w:tc>
@@ -10234,7 +10161,7 @@
                 <w:sz w:val="17"/>
                 <w:shd w:fill="EEF5FC"/>
               </w:rPr>
-              <w:t>/home/pi/PI-SCANNER/runtime/status/analog_2m.json</w:t>
+              <w:t>/home/pi/n0jcg-scanner/runtime/status/analog_2m.json</w:t>
             </w:r>
           </w:p>
         </w:tc>
@@ -10295,7 +10222,7 @@
                 <w:sz w:val="17"/>
                 <w:shd w:fill="EEF5FC"/>
               </w:rPr>
-              <w:t>/home/pi/PI-SCANNER/runtime/status/analog_70cm.json</w:t>
+              <w:t>/home/pi/n0jcg-scanner/runtime/status/analog_70cm.json</w:t>
             </w:r>
           </w:p>
         </w:tc>
@@ -10356,7 +10283,7 @@
                 <w:sz w:val="17"/>
                 <w:shd w:fill="EEF5FC"/>
               </w:rPr>
-              <w:t>/home/pi/PI-SCANNER/runtime/status/vhf_last_call.wav</w:t>
+              <w:t>/home/pi/n0jcg-scanner/runtime/status/vhf_last_call.wav</w:t>
             </w:r>
           </w:p>
         </w:tc>
@@ -10417,7 +10344,7 @@
                 <w:sz w:val="17"/>
                 <w:shd w:fill="EEF5FC"/>
               </w:rPr>
-              <w:t>/home/pi/PI-SCANNER/runtime/status/uhf_last_call.wav</w:t>
+              <w:t>/home/pi/n0jcg-scanner/runtime/status/uhf_last_call.wav</w:t>
             </w:r>
           </w:p>
         </w:tc>
@@ -10602,6 +10529,127 @@
           <w:color w:val="0A1F44"/>
           <w:sz w:val="36"/>
         </w:rPr>
+        <w:t>Registration and five-minute trial</w:t>
+      </w:r>
+    </w:p>
+    <w:p>
+      <w:pPr>
+        <w:keepLines/>
+      </w:pPr>
+      <w:r>
+        <w:rPr>
+          <w:rFonts w:ascii="Arial" w:hAnsi="Arial"/>
+          <w:b w:val="0"/>
+          <w:color w:val="15202B"/>
+          <w:sz w:val="21"/>
+        </w:rPr>
+        <w:t xml:space="preserve">The status bar shows </w:t>
+      </w:r>
+      <w:r>
+        <w:rPr>
+          <w:rFonts w:ascii="Arial" w:hAnsi="Arial"/>
+          <w:b/>
+          <w:color w:val="15202B"/>
+          <w:sz w:val="21"/>
+        </w:rPr>
+        <w:t>Registered</w:t>
+      </w:r>
+      <w:r>
+        <w:rPr>
+          <w:rFonts w:ascii="Arial" w:hAnsi="Arial"/>
+          <w:b w:val="0"/>
+          <w:color w:val="15202B"/>
+          <w:sz w:val="21"/>
+        </w:rPr>
+        <w:t xml:space="preserve">, </w:t>
+      </w:r>
+      <w:r>
+        <w:rPr>
+          <w:rFonts w:ascii="Arial" w:hAnsi="Arial"/>
+          <w:b/>
+          <w:color w:val="15202B"/>
+          <w:sz w:val="21"/>
+        </w:rPr>
+        <w:t>Unregistered</w:t>
+      </w:r>
+      <w:r>
+        <w:rPr>
+          <w:rFonts w:ascii="Arial" w:hAnsi="Arial"/>
+          <w:b w:val="0"/>
+          <w:color w:val="15202B"/>
+          <w:sz w:val="21"/>
+        </w:rPr>
+        <w:t xml:space="preserve">, or a live </w:t>
+      </w:r>
+      <w:r>
+        <w:rPr>
+          <w:rFonts w:ascii="Arial" w:hAnsi="Arial"/>
+          <w:b/>
+          <w:color w:val="15202B"/>
+          <w:sz w:val="21"/>
+        </w:rPr>
+        <w:t>Trial</w:t>
+      </w:r>
+      <w:r>
+        <w:rPr>
+          <w:rFonts w:ascii="Arial" w:hAnsi="Arial"/>
+          <w:b w:val="0"/>
+          <w:color w:val="15202B"/>
+          <w:sz w:val="21"/>
+        </w:rPr>
+        <w:t xml:space="preserve"> countdown. An unregistered scanner operates for five minutes after scanning is started, then automatically stops P25, VHF, and UHF. To register, open </w:t>
+      </w:r>
+      <w:r>
+        <w:rPr>
+          <w:rFonts w:ascii="Arial" w:hAnsi="Arial"/>
+          <w:b/>
+          <w:color w:val="15202B"/>
+          <w:sz w:val="21"/>
+        </w:rPr>
+        <w:t>Menu → Registration</w:t>
+      </w:r>
+      <w:r>
+        <w:rPr>
+          <w:rFonts w:ascii="Arial" w:hAnsi="Arial"/>
+          <w:b w:val="0"/>
+          <w:color w:val="15202B"/>
+          <w:sz w:val="21"/>
+        </w:rPr>
+        <w:t xml:space="preserve">, enter the license S/N supplied by N0JCG and the purchaser email, then select </w:t>
+      </w:r>
+      <w:r>
+        <w:rPr>
+          <w:rFonts w:ascii="Arial" w:hAnsi="Arial"/>
+          <w:b/>
+          <w:color w:val="15202B"/>
+          <w:sz w:val="21"/>
+        </w:rPr>
+        <w:t>Activate license</w:t>
+      </w:r>
+      <w:r>
+        <w:rPr>
+          <w:rFonts w:ascii="Arial" w:hAnsi="Arial"/>
+          <w:b w:val="0"/>
+          <w:color w:val="15202B"/>
+          <w:sz w:val="21"/>
+        </w:rPr>
+        <w:t>. The scanner validates over HTTPS and keeps a signed offline lease. A registered scanner can remain offline for up to seven days after its last successful validation.</w:t>
+      </w:r>
+    </w:p>
+    <w:p>
+      <w:pPr>
+        <w:pStyle w:val="Heading1"/>
+        <w:pBdr>
+          <w:bottom w:val="single" w:sz="8" w:space="4" w:color="00B8D9"/>
+        </w:pBdr>
+      </w:pPr>
+      <w:r>
+        <w:rPr>
+          <w:rFonts w:ascii="Arial" w:hAnsi="Arial"/>
+          <w:b/>
+          <w:color w:val="0A1F44"/>
+          <w:sz w:val="36"/>
+        </w:rPr>
         <w:t>19. Acceptance checklist</w:t>
       </w:r>
     </w:p>
@@ -10738,16 +10786,16 @@
           <w:sz w:val="20"/>
           <w:shd w:fill="EEF5FC"/>
         </w:rPr>
-        <w:t>&lt;ROC_HOST&gt;:8095/pi-scanner/</w:t>
-      </w:r>
-      <w:r>
-        <w:rPr>
-          <w:rFonts w:ascii="Arial" w:hAnsi="Arial"/>
-          <w:b w:val="0"/>
-          <w:color w:val="15202B"/>
-          <w:sz w:val="21"/>
-        </w:rPr>
-        <w:t xml:space="preserve"> loads the scanner and shows </w:t>
+        <w:t>&lt;ROC_HOST&gt;:8095/</w:t>
+      </w:r>
+      <w:r>
+        <w:rPr>
+          <w:rFonts w:ascii="Arial" w:hAnsi="Arial"/>
+          <w:b w:val="0"/>
+          <w:color w:val="15202B"/>
+          <w:sz w:val="21"/>
+        </w:rPr>
+        <w:t xml:space="preserve"> shows an </w:t>
       </w:r>
       <w:r>
         <w:rPr>
@@ -10756,30 +10804,16 @@
           <w:color w:val="15202B"/>
           <w:sz w:val="21"/>
         </w:rPr>
-        <w:t>Connected</w:t>
-      </w:r>
-      <w:r>
-        <w:rPr>
-          <w:rFonts w:ascii="Arial" w:hAnsi="Arial"/>
-          <w:b w:val="0"/>
-          <w:color w:val="15202B"/>
-          <w:sz w:val="21"/>
-        </w:rPr>
-        <w:t>.</w:t>
-      </w:r>
-    </w:p>
-    <w:p>
-      <w:pPr>
-        <w:pStyle w:val="ListBullet"/>
-      </w:pPr>
-      <w:r>
-        <w:rPr>
-          <w:rFonts w:ascii="Arial" w:hAnsi="Arial"/>
-          <w:b w:val="0"/>
-          <w:color w:val="15202B"/>
-          <w:sz w:val="21"/>
-        </w:rPr>
-        <w:t xml:space="preserve">[ ] ROC root </w:t>
+        <w:t>Open Scanner</w:t>
+      </w:r>
+      <w:r>
+        <w:rPr>
+          <w:rFonts w:ascii="Arial" w:hAnsi="Arial"/>
+          <w:b w:val="0"/>
+          <w:color w:val="15202B"/>
+          <w:sz w:val="21"/>
+        </w:rPr>
+        <w:t xml:space="preserve"> link to </w:t>
       </w:r>
       <w:r>
         <w:rPr>
@@ -10789,16 +10823,16 @@
           <w:sz w:val="20"/>
           <w:shd w:fill="EEF5FC"/>
         </w:rPr>
-        <w:t>&lt;ROC_HOST&gt;:8095/</w:t>
-      </w:r>
-      <w:r>
-        <w:rPr>
-          <w:rFonts w:ascii="Arial" w:hAnsi="Arial"/>
-          <w:b w:val="0"/>
-          <w:color w:val="15202B"/>
-          <w:sz w:val="21"/>
-        </w:rPr>
-        <w:t xml:space="preserve"> still loads the main dashboard.</w:t>
+        <w:t>http://&lt;RADIO_HOST&gt;:8070/</w:t>
+      </w:r>
+      <w:r>
+        <w:rPr>
+          <w:rFonts w:ascii="Arial" w:hAnsi="Arial"/>
+          <w:b w:val="0"/>
+          <w:color w:val="15202B"/>
+          <w:sz w:val="21"/>
+        </w:rPr>
+        <w:t>.</w:t>
       </w:r>
     </w:p>
     <w:p>
@@ -10812,7 +10846,7 @@
           <w:color w:val="15202B"/>
           <w:sz w:val="21"/>
         </w:rPr>
-        <w:t xml:space="preserve">[ ] ROC </w:t>
+        <w:t xml:space="preserve">[ ] ROC root </w:t>
       </w:r>
       <w:r>
         <w:rPr>
@@ -10822,16 +10856,16 @@
           <w:sz w:val="20"/>
           <w:shd w:fill="EEF5FC"/>
         </w:rPr>
-        <w:t>/pi-scanner/api/status</w:t>
-      </w:r>
-      <w:r>
-        <w:rPr>
-          <w:rFonts w:ascii="Arial" w:hAnsi="Arial"/>
-          <w:b w:val="0"/>
-          <w:color w:val="15202B"/>
-          <w:sz w:val="21"/>
-        </w:rPr>
-        <w:t xml:space="preserve"> matches the radio Pi scanner state.</w:t>
+        <w:t>&lt;ROC_HOST&gt;:8095/</w:t>
+      </w:r>
+      <w:r>
+        <w:rPr>
+          <w:rFonts w:ascii="Arial" w:hAnsi="Arial"/>
+          <w:b w:val="0"/>
+          <w:color w:val="15202B"/>
+          <w:sz w:val="21"/>
+        </w:rPr>
+        <w:t xml:space="preserve"> still loads the main dashboard.</w:t>
       </w:r>
     </w:p>
     <w:p>
@@ -10845,7 +10879,7 @@
           <w:color w:val="15202B"/>
           <w:sz w:val="21"/>
         </w:rPr>
-        <w:t xml:space="preserve">[ ] Radio host </w:t>
+        <w:t xml:space="preserve">[ ] Radio Pi </w:t>
       </w:r>
       <w:r>
         <w:rPr>
@@ -10855,16 +10889,30 @@
           <w:sz w:val="20"/>
           <w:shd w:fill="EEF5FC"/>
         </w:rPr>
-        <w:t>&lt;RADIO_HOST&gt;:8072/api/audio/status</w:t>
-      </w:r>
-      <w:r>
-        <w:rPr>
-          <w:rFonts w:ascii="Arial" w:hAnsi="Arial"/>
-          <w:b w:val="0"/>
-          <w:color w:val="15202B"/>
-          <w:sz w:val="21"/>
-        </w:rPr>
-        <w:t xml:space="preserve"> reports </w:t>
+        <w:t>&lt;RADIO_HOST&gt;:8070/api/status</w:t>
+      </w:r>
+      <w:r>
+        <w:rPr>
+          <w:rFonts w:ascii="Arial" w:hAnsi="Arial"/>
+          <w:b w:val="0"/>
+          <w:color w:val="15202B"/>
+          <w:sz w:val="21"/>
+        </w:rPr>
+        <w:t xml:space="preserve"> returns the scanner state.</w:t>
+      </w:r>
+    </w:p>
+    <w:p>
+      <w:pPr>
+        <w:pStyle w:val="ListBullet"/>
+      </w:pPr>
+      <w:r>
+        <w:rPr>
+          <w:rFonts w:ascii="Arial" w:hAnsi="Arial"/>
+          <w:b w:val="0"/>
+          <w:color w:val="15202B"/>
+          <w:sz w:val="21"/>
+        </w:rPr>
+        <w:t xml:space="preserve">[ ] Radio host </w:t>
       </w:r>
       <w:r>
         <w:rPr>
@@ -10874,30 +10922,16 @@
           <w:sz w:val="20"/>
           <w:shd w:fill="EEF5FC"/>
         </w:rPr>
-        <w:t>"ok": true</w:t>
-      </w:r>
-      <w:r>
-        <w:rPr>
-          <w:rFonts w:ascii="Arial" w:hAnsi="Arial"/>
-          <w:b w:val="0"/>
-          <w:color w:val="15202B"/>
-          <w:sz w:val="21"/>
-        </w:rPr>
-        <w:t>.</w:t>
-      </w:r>
-    </w:p>
-    <w:p>
-      <w:pPr>
-        <w:pStyle w:val="ListBullet"/>
-      </w:pPr>
-      <w:r>
-        <w:rPr>
-          <w:rFonts w:ascii="Arial" w:hAnsi="Arial"/>
-          <w:b w:val="0"/>
-          <w:color w:val="15202B"/>
-          <w:sz w:val="21"/>
-        </w:rPr>
-        <w:t xml:space="preserve">[ ] </w:t>
+        <w:t>&lt;RADIO_HOST&gt;:8072/api/audio/status</w:t>
+      </w:r>
+      <w:r>
+        <w:rPr>
+          <w:rFonts w:ascii="Arial" w:hAnsi="Arial"/>
+          <w:b w:val="0"/>
+          <w:color w:val="15202B"/>
+          <w:sz w:val="21"/>
+        </w:rPr>
+        <w:t xml:space="preserve"> reports </w:t>
       </w:r>
       <w:r>
         <w:rPr>
@@ -10907,16 +10941,30 @@
           <w:sz w:val="20"/>
           <w:shd w:fill="EEF5FC"/>
         </w:rPr>
-        <w:t>./tools/validate_split_runtime.sh</w:t>
-      </w:r>
-      <w:r>
-        <w:rPr>
-          <w:rFonts w:ascii="Arial" w:hAnsi="Arial"/>
-          <w:b w:val="0"/>
-          <w:color w:val="15202B"/>
-          <w:sz w:val="21"/>
-        </w:rPr>
-        <w:t xml:space="preserve"> reports </w:t>
+        <w:t>"ok": true</w:t>
+      </w:r>
+      <w:r>
+        <w:rPr>
+          <w:rFonts w:ascii="Arial" w:hAnsi="Arial"/>
+          <w:b w:val="0"/>
+          <w:color w:val="15202B"/>
+          <w:sz w:val="21"/>
+        </w:rPr>
+        <w:t>.</w:t>
+      </w:r>
+    </w:p>
+    <w:p>
+      <w:pPr>
+        <w:pStyle w:val="ListBullet"/>
+      </w:pPr>
+      <w:r>
+        <w:rPr>
+          <w:rFonts w:ascii="Arial" w:hAnsi="Arial"/>
+          <w:b w:val="0"/>
+          <w:color w:val="15202B"/>
+          <w:sz w:val="21"/>
+        </w:rPr>
+        <w:t xml:space="preserve">[ ] </w:t>
       </w:r>
       <w:r>
         <w:rPr>
@@ -10926,6 +10974,25 @@
           <w:sz w:val="20"/>
           <w:shd w:fill="EEF5FC"/>
         </w:rPr>
+        <w:t>./tools/validate_split_runtime.sh</w:t>
+      </w:r>
+      <w:r>
+        <w:rPr>
+          <w:rFonts w:ascii="Arial" w:hAnsi="Arial"/>
+          <w:b w:val="0"/>
+          <w:color w:val="15202B"/>
+          <w:sz w:val="21"/>
+        </w:rPr>
+        <w:t xml:space="preserve"> reports </w:t>
+      </w:r>
+      <w:r>
+        <w:rPr>
+          <w:rFonts w:ascii="Consolas" w:hAnsi="Consolas"/>
+          <w:b w:val="0"/>
+          <w:color w:val="0A1F44"/>
+          <w:sz w:val="20"/>
+          <w:shd w:fill="EEF5FC"/>
+        </w:rPr>
         <w:t>FINAL=PASS</w:t>
       </w:r>
       <w:r>
@@ -10935,7 +11002,7 @@
           <w:color w:val="15202B"/>
           <w:sz w:val="21"/>
         </w:rPr>
-        <w:t>.</w:t>
+        <w:t xml:space="preserve"> when the ROC dashboard is available; direct Pi operation remains valid without ROC.</w:t>
       </w:r>
     </w:p>
     <w:p>
@@ -11238,7 +11305,7 @@
         <w:color w:val="6B7785"/>
         <w:sz w:val="17"/>
       </w:rPr>
-      <w:t xml:space="preserve">N0JCG Open Radio Platform  |  N0JCG Scanner v3.0.0        </w:t>
+      <w:t xml:space="preserve">N0JCG Open Radio Platform  |  N0JCG Scanner v4.1.0        </w:t>
     </w:r>
     <w:r>
       <w:rPr>

</xml_diff>

<commit_message>
Make P25 control demodulator profile-controlled
</commit_message>
<xml_diff>
--- a/docs/publications/N0JCG_Scanner_User_Manual.docx
+++ b/docs/publications/N0JCG_Scanner_User_Manual.docx
@@ -662,7 +662,7 @@
           <w:color w:val="15202B"/>
           <w:sz w:val="21"/>
         </w:rPr>
-        <w:t>This manual covers the N0JCG Scanner v4.1.0 production layout: P25 trunked radio, FFT-directed VHF and UHF analog scanning, unified browser audio, radio profiles, and four dedicated RTL-SDR receiver assignments. It is written for both initial installation and normal daily operation.</w:t>
+        <w:t>This manual covers the N0JCG Scanner v4.2.0 production layout: P25 trunked radio, FFT-directed VHF and UHF analog scanning, unified browser audio, radio profiles, and four dedicated RTL-SDR receiver assignments. It is written for both initial installation and normal daily operation.</w:t>
       </w:r>
     </w:p>
     <w:p>
@@ -716,7 +716,7 @@
           <w:color w:val="15202B"/>
           <w:sz w:val="21"/>
         </w:rPr>
-        <w:t xml:space="preserve"> follows permitted, clear P25 talkgroups using dedicated control and voice RTL-SDR receivers.</w:t>
+        <w:t xml:space="preserve"> follows permitted, clear P25 talkgroups using dedicated control and voice RTL-SDR receivers. The production P25 assignment is configured through the role template; the launch path fails closed rather than silently reverting to a single-radio decoder.</w:t>
       </w:r>
     </w:p>
     <w:p>
@@ -6094,8 +6094,8 @@
         <w:tblInd w:w="120" w:type="dxa"/>
       </w:tblPr>
       <w:tblGrid>
-        <w:gridCol w:w="2006"/>
-        <w:gridCol w:w="7354"/>
+        <w:gridCol w:w="1755"/>
+        <w:gridCol w:w="7605"/>
       </w:tblGrid>
       <w:tr>
         <w:trPr>
@@ -6103,7 +6103,7 @@
         </w:trPr>
         <w:tc>
           <w:tcPr>
-            <w:tcW w:type="dxa" w:w="2006"/>
+            <w:tcW w:type="dxa" w:w="1755"/>
             <w:tcMar>
               <w:top w:w="90" w:type="dxa"/>
               <w:start w:w="120" w:type="dxa"/>
@@ -6131,7 +6131,7 @@
         </w:tc>
         <w:tc>
           <w:tcPr>
-            <w:tcW w:type="dxa" w:w="7354"/>
+            <w:tcW w:type="dxa" w:w="7605"/>
             <w:tcMar>
               <w:top w:w="90" w:type="dxa"/>
               <w:start w:w="120" w:type="dxa"/>
@@ -6164,7 +6164,7 @@
         </w:trPr>
         <w:tc>
           <w:tcPr>
-            <w:tcW w:type="dxa" w:w="2006"/>
+            <w:tcW w:type="dxa" w:w="1755"/>
             <w:tcMar>
               <w:top w:w="90" w:type="dxa"/>
               <w:start w:w="120" w:type="dxa"/>
@@ -6192,7 +6192,7 @@
         </w:tc>
         <w:tc>
           <w:tcPr>
-            <w:tcW w:type="dxa" w:w="7354"/>
+            <w:tcW w:type="dxa" w:w="7605"/>
             <w:tcMar>
               <w:top w:w="90" w:type="dxa"/>
               <w:start w:w="120" w:type="dxa"/>
@@ -6263,7 +6263,7 @@
         </w:trPr>
         <w:tc>
           <w:tcPr>
-            <w:tcW w:type="dxa" w:w="2006"/>
+            <w:tcW w:type="dxa" w:w="1755"/>
             <w:tcMar>
               <w:top w:w="90" w:type="dxa"/>
               <w:start w:w="120" w:type="dxa"/>
@@ -6292,7 +6292,7 @@
         </w:tc>
         <w:tc>
           <w:tcPr>
-            <w:tcW w:type="dxa" w:w="7354"/>
+            <w:tcW w:type="dxa" w:w="7605"/>
             <w:tcMar>
               <w:top w:w="90" w:type="dxa"/>
               <w:start w:w="120" w:type="dxa"/>
@@ -6325,7 +6325,7 @@
         </w:trPr>
         <w:tc>
           <w:tcPr>
-            <w:tcW w:type="dxa" w:w="2006"/>
+            <w:tcW w:type="dxa" w:w="1755"/>
             <w:tcMar>
               <w:top w:w="90" w:type="dxa"/>
               <w:start w:w="120" w:type="dxa"/>
@@ -6353,7 +6353,7 @@
         </w:tc>
         <w:tc>
           <w:tcPr>
-            <w:tcW w:type="dxa" w:w="7354"/>
+            <w:tcW w:type="dxa" w:w="7605"/>
             <w:tcMar>
               <w:top w:w="90" w:type="dxa"/>
               <w:start w:w="120" w:type="dxa"/>
@@ -6385,7 +6385,7 @@
         </w:trPr>
         <w:tc>
           <w:tcPr>
-            <w:tcW w:type="dxa" w:w="2006"/>
+            <w:tcW w:type="dxa" w:w="1755"/>
             <w:tcMar>
               <w:top w:w="90" w:type="dxa"/>
               <w:start w:w="120" w:type="dxa"/>
@@ -6414,7 +6414,7 @@
         </w:tc>
         <w:tc>
           <w:tcPr>
-            <w:tcW w:type="dxa" w:w="7354"/>
+            <w:tcW w:type="dxa" w:w="7605"/>
             <w:tcMar>
               <w:top w:w="90" w:type="dxa"/>
               <w:start w:w="120" w:type="dxa"/>
@@ -6447,7 +6447,7 @@
         </w:trPr>
         <w:tc>
           <w:tcPr>
-            <w:tcW w:type="dxa" w:w="2006"/>
+            <w:tcW w:type="dxa" w:w="1755"/>
             <w:tcMar>
               <w:top w:w="90" w:type="dxa"/>
               <w:start w:w="120" w:type="dxa"/>
@@ -6475,7 +6475,7 @@
         </w:tc>
         <w:tc>
           <w:tcPr>
-            <w:tcW w:type="dxa" w:w="7354"/>
+            <w:tcW w:type="dxa" w:w="7605"/>
             <w:tcMar>
               <w:top w:w="90" w:type="dxa"/>
               <w:start w:w="120" w:type="dxa"/>
@@ -6507,7 +6507,7 @@
         </w:trPr>
         <w:tc>
           <w:tcPr>
-            <w:tcW w:type="dxa" w:w="2006"/>
+            <w:tcW w:type="dxa" w:w="1755"/>
             <w:tcMar>
               <w:top w:w="90" w:type="dxa"/>
               <w:start w:w="120" w:type="dxa"/>
@@ -6536,7 +6536,7 @@
         </w:tc>
         <w:tc>
           <w:tcPr>
-            <w:tcW w:type="dxa" w:w="7354"/>
+            <w:tcW w:type="dxa" w:w="7605"/>
             <w:tcMar>
               <w:top w:w="90" w:type="dxa"/>
               <w:start w:w="120" w:type="dxa"/>
@@ -6569,7 +6569,7 @@
         </w:trPr>
         <w:tc>
           <w:tcPr>
-            <w:tcW w:type="dxa" w:w="2006"/>
+            <w:tcW w:type="dxa" w:w="1755"/>
             <w:tcMar>
               <w:top w:w="90" w:type="dxa"/>
               <w:start w:w="120" w:type="dxa"/>
@@ -6597,7 +6597,7 @@
         </w:tc>
         <w:tc>
           <w:tcPr>
-            <w:tcW w:type="dxa" w:w="7354"/>
+            <w:tcW w:type="dxa" w:w="7605"/>
             <w:tcMar>
               <w:top w:w="90" w:type="dxa"/>
               <w:start w:w="120" w:type="dxa"/>
@@ -6649,7 +6649,7 @@
         </w:trPr>
         <w:tc>
           <w:tcPr>
-            <w:tcW w:type="dxa" w:w="2006"/>
+            <w:tcW w:type="dxa" w:w="1755"/>
             <w:tcMar>
               <w:top w:w="90" w:type="dxa"/>
               <w:start w:w="120" w:type="dxa"/>
@@ -6678,7 +6678,7 @@
         </w:tc>
         <w:tc>
           <w:tcPr>
-            <w:tcW w:type="dxa" w:w="7354"/>
+            <w:tcW w:type="dxa" w:w="7605"/>
             <w:tcMar>
               <w:top w:w="90" w:type="dxa"/>
               <w:start w:w="120" w:type="dxa"/>
@@ -6711,7 +6711,7 @@
         </w:trPr>
         <w:tc>
           <w:tcPr>
-            <w:tcW w:type="dxa" w:w="2006"/>
+            <w:tcW w:type="dxa" w:w="1755"/>
             <w:tcMar>
               <w:top w:w="90" w:type="dxa"/>
               <w:start w:w="120" w:type="dxa"/>
@@ -6739,7 +6739,7 @@
         </w:tc>
         <w:tc>
           <w:tcPr>
-            <w:tcW w:type="dxa" w:w="7354"/>
+            <w:tcW w:type="dxa" w:w="7605"/>
             <w:tcMar>
               <w:top w:w="90" w:type="dxa"/>
               <w:start w:w="120" w:type="dxa"/>
@@ -6771,7 +6771,7 @@
         </w:trPr>
         <w:tc>
           <w:tcPr>
-            <w:tcW w:type="dxa" w:w="2006"/>
+            <w:tcW w:type="dxa" w:w="1755"/>
             <w:tcMar>
               <w:top w:w="90" w:type="dxa"/>
               <w:start w:w="120" w:type="dxa"/>
@@ -6800,7 +6800,7 @@
         </w:tc>
         <w:tc>
           <w:tcPr>
-            <w:tcW w:type="dxa" w:w="7354"/>
+            <w:tcW w:type="dxa" w:w="7605"/>
             <w:tcMar>
               <w:top w:w="90" w:type="dxa"/>
               <w:start w:w="120" w:type="dxa"/>
@@ -6822,7 +6822,76 @@
                 <w:color w:val="15202B"/>
                 <w:sz w:val="18"/>
               </w:rPr>
-              <w:t xml:space="preserve">Usually </w:t>
+              <w:t>System modulation metadata; retain the value supplied by the system profile</w:t>
+            </w:r>
+          </w:p>
+        </w:tc>
+      </w:tr>
+      <w:tr>
+        <w:trPr>
+          <w:cantSplit/>
+        </w:trPr>
+        <w:tc>
+          <w:tcPr>
+            <w:tcW w:type="dxa" w:w="1755"/>
+            <w:tcMar>
+              <w:top w:w="90" w:type="dxa"/>
+              <w:start w:w="120" w:type="dxa"/>
+              <w:bottom w:w="90" w:type="dxa"/>
+              <w:end w:w="120" w:type="dxa"/>
+            </w:tcMar>
+            <w:vAlign w:val="center"/>
+          </w:tcPr>
+          <w:p>
+            <w:pPr>
+              <w:spacing w:after="0"/>
+            </w:pPr>
+            <w:r/>
+            <w:r>
+              <w:rPr>
+                <w:rFonts w:ascii="Consolas" w:hAnsi="Consolas"/>
+                <w:b w:val="0"/>
+                <w:color w:val="0A1F44"/>
+                <w:sz w:val="17"/>
+                <w:shd w:fill="EEF5FC"/>
+              </w:rPr>
+              <w:t>ControlDemod</w:t>
+            </w:r>
+          </w:p>
+        </w:tc>
+        <w:tc>
+          <w:tcPr>
+            <w:tcW w:type="dxa" w:w="7605"/>
+            <w:tcMar>
+              <w:top w:w="90" w:type="dxa"/>
+              <w:start w:w="120" w:type="dxa"/>
+              <w:bottom w:w="90" w:type="dxa"/>
+              <w:end w:w="120" w:type="dxa"/>
+            </w:tcMar>
+            <w:vAlign w:val="center"/>
+          </w:tcPr>
+          <w:p>
+            <w:pPr>
+              <w:spacing w:after="0"/>
+            </w:pPr>
+            <w:r/>
+            <w:r>
+              <w:rPr>
+                <w:rFonts w:ascii="Arial" w:hAnsi="Arial"/>
+                <w:b/>
+                <w:color w:val="15202B"/>
+                <w:sz w:val="18"/>
+              </w:rPr>
+              <w:t>Required.</w:t>
+            </w:r>
+            <w:r>
+              <w:rPr>
+                <w:rFonts w:ascii="Arial" w:hAnsi="Arial"/>
+                <w:b w:val="0"/>
+                <w:color w:val="15202B"/>
+                <w:sz w:val="18"/>
+              </w:rPr>
+              <w:t xml:space="preserve"> OP25 control-channel demodulator. Use </w:t>
             </w:r>
             <w:r>
               <w:rPr>
@@ -6832,7 +6901,7 @@
                 <w:sz w:val="17"/>
                 <w:shd w:fill="EEF5FC"/>
               </w:rPr>
-              <w:t>CQPSK</w:t>
+              <w:t>fsk4</w:t>
             </w:r>
             <w:r>
               <w:rPr>
@@ -6841,7 +6910,7 @@
                 <w:color w:val="15202B"/>
                 <w:sz w:val="18"/>
               </w:rPr>
-              <w:t xml:space="preserve"> for the validated system</w:t>
+              <w:t xml:space="preserve"> for Colorado DTRS C4FM control channels.</w:t>
             </w:r>
           </w:p>
         </w:tc>
@@ -6863,7 +6932,64 @@
           <w:color w:val="15202B"/>
           <w:sz w:val="21"/>
         </w:rPr>
-        <w:t>Every imported system must have at least one enabled control-channel row. Talkgroup IDs must be unique within the system and range from 0 through 65535. N0JCG Scanner does not decode encrypted traffic even if an encrypted talkgroup is present in a CSV.</w:t>
+        <w:t xml:space="preserve">Every imported system must have at least one enabled control-channel row. Every P25 profile must define </w:t>
+      </w:r>
+      <w:r>
+        <w:rPr>
+          <w:rFonts w:ascii="Consolas" w:hAnsi="Consolas"/>
+          <w:b w:val="0"/>
+          <w:color w:val="0A1F44"/>
+          <w:sz w:val="20"/>
+          <w:shd w:fill="EEF5FC"/>
+        </w:rPr>
+        <w:t>control_demod_type</w:t>
+      </w:r>
+      <w:r>
+        <w:rPr>
+          <w:rFonts w:ascii="Arial" w:hAnsi="Arial"/>
+          <w:b w:val="0"/>
+          <w:color w:val="15202B"/>
+          <w:sz w:val="21"/>
+        </w:rPr>
+        <w:t xml:space="preserve">; this value controls the control-channel demodulator used by OP25. For Colorado DTRS, set </w:t>
+      </w:r>
+      <w:r>
+        <w:rPr>
+          <w:rFonts w:ascii="Consolas" w:hAnsi="Consolas"/>
+          <w:b w:val="0"/>
+          <w:color w:val="0A1F44"/>
+          <w:sz w:val="20"/>
+          <w:shd w:fill="EEF5FC"/>
+        </w:rPr>
+        <w:t>control_demod_type</w:t>
+      </w:r>
+      <w:r>
+        <w:rPr>
+          <w:rFonts w:ascii="Arial" w:hAnsi="Arial"/>
+          <w:b w:val="0"/>
+          <w:color w:val="15202B"/>
+          <w:sz w:val="21"/>
+        </w:rPr>
+        <w:t xml:space="preserve"> to </w:t>
+      </w:r>
+      <w:r>
+        <w:rPr>
+          <w:rFonts w:ascii="Consolas" w:hAnsi="Consolas"/>
+          <w:b w:val="0"/>
+          <w:color w:val="0A1F44"/>
+          <w:sz w:val="20"/>
+          <w:shd w:fill="EEF5FC"/>
+        </w:rPr>
+        <w:t>fsk4</w:t>
+      </w:r>
+      <w:r>
+        <w:rPr>
+          <w:rFonts w:ascii="Arial" w:hAnsi="Arial"/>
+          <w:b w:val="0"/>
+          <w:color w:val="15202B"/>
+          <w:sz w:val="21"/>
+        </w:rPr>
+        <w:t>. Do not rely on the legacy runtime marker or an environment override to select the control demodulator. Talkgroup IDs must be unique within the system and range from 0 through 65535. N0JCG Scanner does not decode encrypted traffic even if an encrypted talkgroup is present in a CSV.</w:t>
       </w:r>
     </w:p>
     <w:p>

</xml_diff>

<commit_message>
Document new Pi installation workflow
</commit_message>
<xml_diff>
--- a/docs/publications/N0JCG_Scanner_User_Manual.docx
+++ b/docs/publications/N0JCG_Scanner_User_Manual.docx
@@ -350,6 +350,20 @@
           <w:color w:val="15202B"/>
           <w:sz w:val="21"/>
         </w:rPr>
+        <w:t>Getting started: new installation</w:t>
+      </w:r>
+    </w:p>
+    <w:p>
+      <w:pPr>
+        <w:pStyle w:val="ListNumber"/>
+      </w:pPr>
+      <w:r>
+        <w:rPr>
+          <w:rFonts w:ascii="Arial" w:hAnsi="Arial"/>
+          <w:b w:val="0"/>
+          <w:color w:val="15202B"/>
+          <w:sz w:val="21"/>
+        </w:rPr>
         <w:t>What N0JCG Scanner does</w:t>
       </w:r>
     </w:p>
@@ -663,6 +677,567 @@
           <w:sz w:val="21"/>
         </w:rPr>
         <w:t>This manual covers the N0JCG Scanner v4.2.0 production layout: P25 trunked radio, FFT-directed VHF and UHF analog scanning, unified browser audio, radio profiles, and four dedicated RTL-SDR receiver assignments. It is written for both initial installation and normal daily operation.</w:t>
+      </w:r>
+    </w:p>
+    <w:p>
+      <w:pPr>
+        <w:pStyle w:val="Heading1"/>
+        <w:pBdr>
+          <w:bottom w:val="single" w:sz="8" w:space="4" w:color="00B8D9"/>
+        </w:pBdr>
+      </w:pPr>
+      <w:r>
+        <w:rPr>
+          <w:rFonts w:ascii="Arial" w:hAnsi="Arial"/>
+          <w:b/>
+          <w:color w:val="0A1F44"/>
+          <w:sz w:val="36"/>
+        </w:rPr>
+        <w:t>Getting started: new installation</w:t>
+      </w:r>
+    </w:p>
+    <w:p>
+      <w:pPr>
+        <w:keepLines/>
+      </w:pPr>
+      <w:r>
+        <w:rPr>
+          <w:rFonts w:ascii="Arial" w:hAnsi="Arial"/>
+          <w:b w:val="0"/>
+          <w:color w:val="15202B"/>
+          <w:sz w:val="21"/>
+        </w:rPr>
+        <w:t>This section is for a new scanner appliance that has not yet been configured. The complete first-install wizard is checked into the repository, so the operator does not need to copy individual service files or manually assemble the receiver configuration.</w:t>
+      </w:r>
+    </w:p>
+    <w:p>
+      <w:pPr>
+        <w:pStyle w:val="Heading2"/>
+      </w:pPr>
+      <w:r>
+        <w:rPr>
+          <w:rFonts w:ascii="Arial" w:hAnsi="Arial"/>
+          <w:b/>
+          <w:color w:val="1565C0"/>
+          <w:sz w:val="28"/>
+        </w:rPr>
+        <w:t>Hardware you need</w:t>
+      </w:r>
+    </w:p>
+    <w:p>
+      <w:pPr>
+        <w:pStyle w:val="ListBullet"/>
+      </w:pPr>
+      <w:r>
+        <w:rPr>
+          <w:rFonts w:ascii="Arial" w:hAnsi="Arial"/>
+          <w:b w:val="0"/>
+          <w:color w:val="15202B"/>
+          <w:sz w:val="21"/>
+        </w:rPr>
+        <w:t>Raspberry Pi 5 (4 GB or more recommended) with a reliable USB-C power supply.</w:t>
+      </w:r>
+    </w:p>
+    <w:p>
+      <w:pPr>
+        <w:pStyle w:val="ListBullet"/>
+      </w:pPr>
+      <w:r>
+        <w:rPr>
+          <w:rFonts w:ascii="Arial" w:hAnsi="Arial"/>
+          <w:b w:val="0"/>
+          <w:color w:val="15202B"/>
+          <w:sz w:val="21"/>
+        </w:rPr>
+        <w:t>A high-endurance microSD card, 32 GB or larger, for Raspberry Pi OS and the scanner software. A 64 GB card is preferred when retaining diagnostic logs.</w:t>
+      </w:r>
+    </w:p>
+    <w:p>
+      <w:pPr>
+        <w:pStyle w:val="ListBullet"/>
+      </w:pPr>
+      <w:r>
+        <w:rPr>
+          <w:rFonts w:ascii="Arial" w:hAnsi="Arial"/>
+          <w:b w:val="0"/>
+          <w:color w:val="15202B"/>
+          <w:sz w:val="21"/>
+        </w:rPr>
+        <w:t>A powered USB 3 hub with enough ports and current capacity for four RTL-SDR receivers. Avoid unpowered hubs for a permanent installation.</w:t>
+      </w:r>
+    </w:p>
+    <w:p>
+      <w:pPr>
+        <w:pStyle w:val="ListBullet"/>
+      </w:pPr>
+      <w:r>
+        <w:rPr>
+          <w:rFonts w:ascii="Arial" w:hAnsi="Arial"/>
+          <w:b w:val="0"/>
+          <w:color w:val="15202B"/>
+          <w:sz w:val="21"/>
+        </w:rPr>
+        <w:t>Four RTL-SDR dongles with direct USB access. The installer assigns stable serial numbers to each one; do not connect all four during serial setup.</w:t>
+      </w:r>
+    </w:p>
+    <w:p>
+      <w:pPr>
+        <w:pStyle w:val="ListBullet"/>
+      </w:pPr>
+      <w:r>
+        <w:rPr>
+          <w:rFonts w:ascii="Arial" w:hAnsi="Arial"/>
+          <w:b w:val="0"/>
+          <w:color w:val="15202B"/>
+          <w:sz w:val="21"/>
+        </w:rPr>
+        <w:t>A network connection from the Pi to the operator browser. Wired Ethernet is preferred; Wi-Fi is acceptable where Ethernet is unavailable.</w:t>
+      </w:r>
+    </w:p>
+    <w:p>
+      <w:pPr>
+        <w:pStyle w:val="ListBullet"/>
+      </w:pPr>
+      <w:r>
+        <w:rPr>
+          <w:rFonts w:ascii="Arial" w:hAnsi="Arial"/>
+          <w:b w:val="0"/>
+          <w:color w:val="15202B"/>
+          <w:sz w:val="21"/>
+        </w:rPr>
+        <w:t>Receive-only antennas, coax, and any needed band filters or splitters.</w:t>
+      </w:r>
+    </w:p>
+    <w:p>
+      <w:pPr>
+        <w:pStyle w:val="Heading2"/>
+      </w:pPr>
+      <w:r>
+        <w:rPr>
+          <w:rFonts w:ascii="Arial" w:hAnsi="Arial"/>
+          <w:b/>
+          <w:color w:val="1565C0"/>
+          <w:sz w:val="28"/>
+        </w:rPr>
+        <w:t>Antenna recommendations</w:t>
+      </w:r>
+    </w:p>
+    <w:p>
+      <w:pPr>
+        <w:keepLines/>
+      </w:pPr>
+      <w:r>
+        <w:rPr>
+          <w:rFonts w:ascii="Arial" w:hAnsi="Arial"/>
+          <w:b w:val="0"/>
+          <w:color w:val="15202B"/>
+          <w:sz w:val="21"/>
+        </w:rPr>
+        <w:t>Use antennas appropriate to the bands you intend to monitor. A 2 m/VHF scanner antenna is appropriate for the VHF FFT receiver, and a 70 cm/UHF antenna is appropriate for the UHF receiver. P25 700/800 MHz systems benefit from a dedicated 700/800 MHz antenna; a directional Yagi can improve a known site, while a discone is useful for broad coverage. Keep antennas separated from transmit antennas and use filtering or attenuation if a nearby transmitter overloads an SDR. The P25 control and voice receivers may share an antenna through a suitable splitter, but each SDR must remain a separate USB receiver.</w:t>
+      </w:r>
+    </w:p>
+    <w:p>
+      <w:pPr>
+        <w:pStyle w:val="Heading2"/>
+      </w:pPr>
+      <w:r>
+        <w:rPr>
+          <w:rFonts w:ascii="Arial" w:hAnsi="Arial"/>
+          <w:b/>
+          <w:color w:val="1565C0"/>
+          <w:sz w:val="28"/>
+        </w:rPr>
+        <w:t>Prepare the Pi and SD card</w:t>
+      </w:r>
+    </w:p>
+    <w:p>
+      <w:pPr>
+        <w:pStyle w:val="ListNumber"/>
+        <w:numPr>
+          <w:ilvl w:val="0"/>
+          <w:numId w:val="10"/>
+        </w:numPr>
+      </w:pPr>
+      <w:r>
+        <w:rPr>
+          <w:rFonts w:ascii="Arial" w:hAnsi="Arial"/>
+          <w:b w:val="0"/>
+          <w:color w:val="15202B"/>
+          <w:sz w:val="21"/>
+        </w:rPr>
+        <w:t>Use Raspberry Pi Imager on a workstation to write a current 64-bit Raspberry Pi OS image to the microSD card.</w:t>
+      </w:r>
+    </w:p>
+    <w:p>
+      <w:pPr>
+        <w:pStyle w:val="ListNumber"/>
+        <w:numPr>
+          <w:ilvl w:val="0"/>
+          <w:numId w:val="10"/>
+        </w:numPr>
+      </w:pPr>
+      <w:r>
+        <w:rPr>
+          <w:rFonts w:ascii="Arial" w:hAnsi="Arial"/>
+          <w:b w:val="0"/>
+          <w:color w:val="15202B"/>
+          <w:sz w:val="21"/>
+        </w:rPr>
+        <w:t>In the Imager customization panel, set the hostname, enable SSH, create the intended Linux user, and configure the network when practical.</w:t>
+      </w:r>
+    </w:p>
+    <w:p>
+      <w:pPr>
+        <w:pStyle w:val="ListNumber"/>
+        <w:numPr>
+          <w:ilvl w:val="0"/>
+          <w:numId w:val="10"/>
+        </w:numPr>
+      </w:pPr>
+      <w:r>
+        <w:rPr>
+          <w:rFonts w:ascii="Arial" w:hAnsi="Arial"/>
+          <w:b w:val="0"/>
+          <w:color w:val="15202B"/>
+          <w:sz w:val="21"/>
+        </w:rPr>
+        <w:t>Boot the Pi with the display, keyboard, network, and powered USB hub attached. Complete the first-boot prompts and apply OS updates.</w:t>
+      </w:r>
+    </w:p>
+    <w:p>
+      <w:pPr>
+        <w:pStyle w:val="ListNumber"/>
+        <w:numPr>
+          <w:ilvl w:val="0"/>
+          <w:numId w:val="10"/>
+        </w:numPr>
+      </w:pPr>
+      <w:r>
+        <w:rPr>
+          <w:rFonts w:ascii="Arial" w:hAnsi="Arial"/>
+          <w:b w:val="0"/>
+          <w:color w:val="15202B"/>
+          <w:sz w:val="21"/>
+        </w:rPr>
+        <w:t>Confirm the Pi's IP address and verify SSH from the MSYS/Git Bash machine:</w:t>
+      </w:r>
+    </w:p>
+    <w:p>
+      <w:pPr>
+        <w:keepLines/>
+        <w:spacing w:before="60" w:after="160" w:line="240" w:lineRule="auto"/>
+        <w:ind w:left="173" w:right="173"/>
+        <w:shd w:fill="EEF2F6"/>
+        <w:pBdr>
+          <w:left w:val="single" w:sz="10" w:space="7" w:color="1565C0"/>
+        </w:pBdr>
+      </w:pPr>
+      <w:r>
+        <w:rPr>
+          <w:rFonts w:ascii="Consolas" w:hAnsi="Consolas"/>
+          <w:color w:val="2B3440"/>
+          <w:sz w:val="16"/>
+        </w:rPr>
+        <w:t xml:space="preserve">   ssh &lt;user&gt;@&lt;pi-ip&gt;</w:t>
+      </w:r>
+    </w:p>
+    <w:p>
+      <w:pPr>
+        <w:keepLines/>
+      </w:pPr>
+      <w:r>
+        <w:rPr>
+          <w:rFonts w:ascii="Arial" w:hAnsi="Arial"/>
+          <w:b w:val="0"/>
+          <w:color w:val="15202B"/>
+          <w:sz w:val="21"/>
+        </w:rPr>
+        <w:t>Do not attach the RTL-SDRs until the installer reaches the serial-assignment prompts. This prevents Linux device indexes from being confused during the one-at-a-time assignment process.</w:t>
+      </w:r>
+    </w:p>
+    <w:p>
+      <w:pPr>
+        <w:pStyle w:val="Heading2"/>
+      </w:pPr>
+      <w:r>
+        <w:rPr>
+          <w:rFonts w:ascii="Arial" w:hAnsi="Arial"/>
+          <w:b/>
+          <w:color w:val="1565C0"/>
+          <w:sz w:val="28"/>
+        </w:rPr>
+        <w:t>Run the first-install wizard</w:t>
+      </w:r>
+    </w:p>
+    <w:p>
+      <w:pPr>
+        <w:keepLines/>
+      </w:pPr>
+      <w:r>
+        <w:rPr>
+          <w:rFonts w:ascii="Arial" w:hAnsi="Arial"/>
+          <w:b w:val="0"/>
+          <w:color w:val="15202B"/>
+          <w:sz w:val="21"/>
+        </w:rPr>
+        <w:t>From the checked-out repository on the workstation, in MSYS/Git Bash, run:</w:t>
+      </w:r>
+    </w:p>
+    <w:p>
+      <w:pPr>
+        <w:keepLines/>
+        <w:spacing w:before="60" w:after="160" w:line="240" w:lineRule="auto"/>
+        <w:ind w:left="173" w:right="173"/>
+        <w:shd w:fill="EEF2F6"/>
+        <w:pBdr>
+          <w:left w:val="single" w:sz="10" w:space="7" w:color="1565C0"/>
+        </w:pBdr>
+      </w:pPr>
+      <w:r>
+        <w:rPr>
+          <w:rFonts w:ascii="Consolas" w:hAnsi="Consolas"/>
+          <w:color w:val="2B3440"/>
+          <w:sz w:val="16"/>
+        </w:rPr>
+        <w:t>cd /c/msys64/home/&lt;windows-user&gt;/sdrdev/PI-SCANNER</w:t>
+        <w:br/>
+        <w:t>./tools/install_n0jcg_scanner_pi.sh</w:t>
+      </w:r>
+    </w:p>
+    <w:p>
+      <w:pPr>
+        <w:keepLines/>
+      </w:pPr>
+      <w:r>
+        <w:rPr>
+          <w:rFonts w:ascii="Arial" w:hAnsi="Arial"/>
+          <w:b w:val="0"/>
+          <w:color w:val="15202B"/>
+          <w:sz w:val="21"/>
+        </w:rPr>
+        <w:t xml:space="preserve">The wizard asks for the Pi IP address, SSH user (default </w:t>
+      </w:r>
+      <w:r>
+        <w:rPr>
+          <w:rFonts w:ascii="Consolas" w:hAnsi="Consolas"/>
+          <w:b w:val="0"/>
+          <w:color w:val="0A1F44"/>
+          <w:sz w:val="20"/>
+          <w:shd w:fill="EEF5FC"/>
+        </w:rPr>
+        <w:t>pi</w:t>
+      </w:r>
+      <w:r>
+        <w:rPr>
+          <w:rFonts w:ascii="Arial" w:hAnsi="Arial"/>
+          <w:b w:val="0"/>
+          <w:color w:val="15202B"/>
+          <w:sz w:val="21"/>
+        </w:rPr>
+        <w:t xml:space="preserve">), and SSH password. It saves reusable values in the local </w:t>
+      </w:r>
+      <w:r>
+        <w:rPr>
+          <w:rFonts w:ascii="Consolas" w:hAnsi="Consolas"/>
+          <w:b w:val="0"/>
+          <w:color w:val="0A1F44"/>
+          <w:sz w:val="20"/>
+          <w:shd w:fill="EEF5FC"/>
+        </w:rPr>
+        <w:t>.env</w:t>
+      </w:r>
+      <w:r>
+        <w:rPr>
+          <w:rFonts w:ascii="Arial" w:hAnsi="Arial"/>
+          <w:b w:val="0"/>
+          <w:color w:val="15202B"/>
+          <w:sz w:val="21"/>
+        </w:rPr>
+        <w:t xml:space="preserve"> file. That file contains a password and must remain private.</w:t>
+      </w:r>
+    </w:p>
+    <w:p>
+      <w:pPr>
+        <w:keepLines/>
+      </w:pPr>
+      <w:r>
+        <w:rPr>
+          <w:rFonts w:ascii="Arial" w:hAnsi="Arial"/>
+          <w:b w:val="0"/>
+          <w:color w:val="15202B"/>
+          <w:sz w:val="21"/>
+        </w:rPr>
+        <w:t xml:space="preserve">The wizard installs the required OS packages, deploys the application to </w:t>
+      </w:r>
+      <w:r>
+        <w:rPr>
+          <w:rFonts w:ascii="Consolas" w:hAnsi="Consolas"/>
+          <w:b w:val="0"/>
+          <w:color w:val="0A1F44"/>
+          <w:sz w:val="20"/>
+          <w:shd w:fill="EEF5FC"/>
+        </w:rPr>
+        <w:t>/home/&lt;user&gt;/n0jcg-scanner</w:t>
+      </w:r>
+      <w:r>
+        <w:rPr>
+          <w:rFonts w:ascii="Arial" w:hAnsi="Arial"/>
+          <w:b w:val="0"/>
+          <w:color w:val="15202B"/>
+          <w:sz w:val="21"/>
+        </w:rPr>
+        <w:t>, installs path-correct systemd units, and leaves all scanner services stopped. It then prompts for each receiver in turn:</w:t>
+      </w:r>
+    </w:p>
+    <w:p>
+      <w:pPr>
+        <w:pStyle w:val="ListNumber"/>
+        <w:numPr>
+          <w:ilvl w:val="0"/>
+          <w:numId w:val="11"/>
+        </w:numPr>
+      </w:pPr>
+      <w:r>
+        <w:rPr>
+          <w:rFonts w:ascii="Arial" w:hAnsi="Arial"/>
+          <w:b w:val="0"/>
+          <w:color w:val="15202B"/>
+          <w:sz w:val="21"/>
+        </w:rPr>
+        <w:t>Insert only the P25 Control SDR; the wizard assigns the required production serial, verifies it, and asks you to remove it.</w:t>
+      </w:r>
+    </w:p>
+    <w:p>
+      <w:pPr>
+        <w:pStyle w:val="ListNumber"/>
+        <w:numPr>
+          <w:ilvl w:val="0"/>
+          <w:numId w:val="11"/>
+        </w:numPr>
+      </w:pPr>
+      <w:r>
+        <w:rPr>
+          <w:rFonts w:ascii="Arial" w:hAnsi="Arial"/>
+          <w:b w:val="0"/>
+          <w:color w:val="15202B"/>
+          <w:sz w:val="21"/>
+        </w:rPr>
+        <w:t>Insert only the P25 Voice SDR; it assigns and verifies its required production serial.</w:t>
+      </w:r>
+    </w:p>
+    <w:p>
+      <w:pPr>
+        <w:pStyle w:val="ListNumber"/>
+        <w:numPr>
+          <w:ilvl w:val="0"/>
+          <w:numId w:val="11"/>
+        </w:numPr>
+      </w:pPr>
+      <w:r>
+        <w:rPr>
+          <w:rFonts w:ascii="Arial" w:hAnsi="Arial"/>
+          <w:b w:val="0"/>
+          <w:color w:val="15202B"/>
+          <w:sz w:val="21"/>
+        </w:rPr>
+        <w:t>Insert only the VHF / 2 m SDR; it assigns and verifies its required production serial.</w:t>
+      </w:r>
+    </w:p>
+    <w:p>
+      <w:pPr>
+        <w:pStyle w:val="ListNumber"/>
+        <w:numPr>
+          <w:ilvl w:val="0"/>
+          <w:numId w:val="11"/>
+        </w:numPr>
+      </w:pPr>
+      <w:r>
+        <w:rPr>
+          <w:rFonts w:ascii="Arial" w:hAnsi="Arial"/>
+          <w:b w:val="0"/>
+          <w:color w:val="15202B"/>
+          <w:sz w:val="21"/>
+        </w:rPr>
+        <w:t>Insert only the UHF / 70 cm SDR; it assigns and verifies its required production serial.</w:t>
+      </w:r>
+    </w:p>
+    <w:p>
+      <w:pPr>
+        <w:keepLines/>
+      </w:pPr>
+      <w:r>
+        <w:rPr>
+          <w:rFonts w:ascii="Arial" w:hAnsi="Arial"/>
+          <w:b w:val="0"/>
+          <w:color w:val="15202B"/>
+          <w:sz w:val="21"/>
+        </w:rPr>
+        <w:t>The serial numbers are required production assignments and are not entered manually. If an assignment fails, stop and correct the physical USB connection before continuing. The wizard validates the RTL tools, Python modules, role map, and service files before it finishes. It does not start the services.</w:t>
+      </w:r>
+    </w:p>
+    <w:p>
+      <w:pPr>
+        <w:pStyle w:val="Heading2"/>
+      </w:pPr>
+      <w:r>
+        <w:rPr>
+          <w:rFonts w:ascii="Arial" w:hAnsi="Arial"/>
+          <w:b/>
+          <w:color w:val="1565C0"/>
+          <w:sz w:val="28"/>
+        </w:rPr>
+        <w:t>Load the first radio profile</w:t>
+      </w:r>
+    </w:p>
+    <w:p>
+      <w:pPr>
+        <w:keepLines/>
+      </w:pPr>
+      <w:r>
+        <w:rPr>
+          <w:rFonts w:ascii="Arial" w:hAnsi="Arial"/>
+          <w:b w:val="0"/>
+          <w:color w:val="15202B"/>
+          <w:sz w:val="21"/>
+        </w:rPr>
+        <w:t xml:space="preserve">Open </w:t>
+      </w:r>
+      <w:r>
+        <w:rPr>
+          <w:rFonts w:ascii="Consolas" w:hAnsi="Consolas"/>
+          <w:b w:val="0"/>
+          <w:color w:val="0A1F44"/>
+          <w:sz w:val="20"/>
+          <w:shd w:fill="EEF5FC"/>
+        </w:rPr>
+        <w:t>http://&lt;pi-ip&gt;:8070/</w:t>
+      </w:r>
+      <w:r>
+        <w:rPr>
+          <w:rFonts w:ascii="Arial" w:hAnsi="Arial"/>
+          <w:b w:val="0"/>
+          <w:color w:val="15202B"/>
+          <w:sz w:val="21"/>
+        </w:rPr>
+        <w:t xml:space="preserve"> after installation. Because no named profile exists on a new installation, the application opens directly on </w:t>
+      </w:r>
+      <w:r>
+        <w:rPr>
+          <w:rFonts w:ascii="Arial" w:hAnsi="Arial"/>
+          <w:b/>
+          <w:color w:val="15202B"/>
+          <w:sz w:val="21"/>
+        </w:rPr>
+        <w:t>Radio setup</w:t>
+      </w:r>
+      <w:r>
+        <w:rPr>
+          <w:rFonts w:ascii="Arial" w:hAnsi="Arial"/>
+          <w:b w:val="0"/>
+          <w:color w:val="15202B"/>
+          <w:sz w:val="21"/>
+        </w:rPr>
+        <w:t>. Use the downloadable P25 and CHIRP CSV templates to create/import a profile, review the receiver roles and frequencies, and save the profile. Only after the role map and profile validate should the administrator enable and start the scanner services using the commands printed by the wizard.</w:t>
       </w:r>
     </w:p>
     <w:p>
@@ -4810,7 +5385,7 @@
         <w:pStyle w:val="ListNumber"/>
         <w:numPr>
           <w:ilvl w:val="0"/>
-          <w:numId w:val="10"/>
+          <w:numId w:val="12"/>
         </w:numPr>
       </w:pPr>
       <w:r>
@@ -4839,391 +5414,6 @@
           <w:sz w:val="21"/>
         </w:rPr>
         <w:t>.</w:t>
-      </w:r>
-    </w:p>
-    <w:p>
-      <w:pPr>
-        <w:pStyle w:val="ListNumber"/>
-        <w:numPr>
-          <w:ilvl w:val="0"/>
-          <w:numId w:val="10"/>
-        </w:numPr>
-      </w:pPr>
-      <w:r>
-        <w:rPr>
-          <w:rFonts w:ascii="Arial" w:hAnsi="Arial"/>
-          <w:b w:val="0"/>
-          <w:color w:val="15202B"/>
-          <w:sz w:val="21"/>
-        </w:rPr>
-        <w:t xml:space="preserve">Press </w:t>
-      </w:r>
-      <w:r>
-        <w:rPr>
-          <w:rFonts w:ascii="Arial" w:hAnsi="Arial"/>
-          <w:b/>
-          <w:color w:val="15202B"/>
-          <w:sz w:val="21"/>
-        </w:rPr>
-        <w:t>Save Current</w:t>
-      </w:r>
-      <w:r>
-        <w:rPr>
-          <w:rFonts w:ascii="Arial" w:hAnsi="Arial"/>
-          <w:b w:val="0"/>
-          <w:color w:val="15202B"/>
-          <w:sz w:val="21"/>
-        </w:rPr>
-        <w:t>.</w:t>
-      </w:r>
-    </w:p>
-    <w:p>
-      <w:pPr>
-        <w:pStyle w:val="ListNumber"/>
-        <w:numPr>
-          <w:ilvl w:val="0"/>
-          <w:numId w:val="10"/>
-        </w:numPr>
-      </w:pPr>
-      <w:r>
-        <w:rPr>
-          <w:rFonts w:ascii="Arial" w:hAnsi="Arial"/>
-          <w:b w:val="0"/>
-          <w:color w:val="15202B"/>
-          <w:sz w:val="21"/>
-        </w:rPr>
-        <w:t xml:space="preserve">Press </w:t>
-      </w:r>
-      <w:r>
-        <w:rPr>
-          <w:rFonts w:ascii="Arial" w:hAnsi="Arial"/>
-          <w:b/>
-          <w:color w:val="15202B"/>
-          <w:sz w:val="21"/>
-        </w:rPr>
-        <w:t>Refresh Profiles</w:t>
-      </w:r>
-      <w:r>
-        <w:rPr>
-          <w:rFonts w:ascii="Arial" w:hAnsi="Arial"/>
-          <w:b w:val="0"/>
-          <w:color w:val="15202B"/>
-          <w:sz w:val="21"/>
-        </w:rPr>
-        <w:t xml:space="preserve"> if the new name does not appear immediately.</w:t>
-      </w:r>
-    </w:p>
-    <w:p>
-      <w:pPr>
-        <w:pStyle w:val="Heading2"/>
-      </w:pPr>
-      <w:r>
-        <w:rPr>
-          <w:rFonts w:ascii="Arial" w:hAnsi="Arial"/>
-          <w:b/>
-          <w:color w:val="1565C0"/>
-          <w:sz w:val="28"/>
-        </w:rPr>
-        <w:t>Load a profile</w:t>
-      </w:r>
-    </w:p>
-    <w:p>
-      <w:pPr>
-        <w:pStyle w:val="ListNumber"/>
-        <w:numPr>
-          <w:ilvl w:val="0"/>
-          <w:numId w:val="11"/>
-        </w:numPr>
-      </w:pPr>
-      <w:r>
-        <w:rPr>
-          <w:rFonts w:ascii="Arial" w:hAnsi="Arial"/>
-          <w:b w:val="0"/>
-          <w:color w:val="15202B"/>
-          <w:sz w:val="21"/>
-        </w:rPr>
-        <w:t xml:space="preserve">Select it under </w:t>
-      </w:r>
-      <w:r>
-        <w:rPr>
-          <w:rFonts w:ascii="Arial" w:hAnsi="Arial"/>
-          <w:b/>
-          <w:color w:val="15202B"/>
-          <w:sz w:val="21"/>
-        </w:rPr>
-        <w:t>Saved Profile</w:t>
-      </w:r>
-      <w:r>
-        <w:rPr>
-          <w:rFonts w:ascii="Arial" w:hAnsi="Arial"/>
-          <w:b w:val="0"/>
-          <w:color w:val="15202B"/>
-          <w:sz w:val="21"/>
-        </w:rPr>
-        <w:t>.</w:t>
-      </w:r>
-    </w:p>
-    <w:p>
-      <w:pPr>
-        <w:pStyle w:val="ListNumber"/>
-        <w:numPr>
-          <w:ilvl w:val="0"/>
-          <w:numId w:val="11"/>
-        </w:numPr>
-      </w:pPr>
-      <w:r>
-        <w:rPr>
-          <w:rFonts w:ascii="Arial" w:hAnsi="Arial"/>
-          <w:b w:val="0"/>
-          <w:color w:val="15202B"/>
-          <w:sz w:val="21"/>
-        </w:rPr>
-        <w:t xml:space="preserve">Press </w:t>
-      </w:r>
-      <w:r>
-        <w:rPr>
-          <w:rFonts w:ascii="Arial" w:hAnsi="Arial"/>
-          <w:b/>
-          <w:color w:val="15202B"/>
-          <w:sz w:val="21"/>
-        </w:rPr>
-        <w:t>Load Selected Profile</w:t>
-      </w:r>
-      <w:r>
-        <w:rPr>
-          <w:rFonts w:ascii="Arial" w:hAnsi="Arial"/>
-          <w:b w:val="0"/>
-          <w:color w:val="15202B"/>
-          <w:sz w:val="21"/>
-        </w:rPr>
-        <w:t>.</w:t>
-      </w:r>
-    </w:p>
-    <w:p>
-      <w:pPr>
-        <w:pStyle w:val="ListNumber"/>
-        <w:numPr>
-          <w:ilvl w:val="0"/>
-          <w:numId w:val="11"/>
-        </w:numPr>
-      </w:pPr>
-      <w:r>
-        <w:rPr>
-          <w:rFonts w:ascii="Arial" w:hAnsi="Arial"/>
-          <w:b w:val="0"/>
-          <w:color w:val="15202B"/>
-          <w:sz w:val="21"/>
-        </w:rPr>
-        <w:t xml:space="preserve">For a P25 system change, press </w:t>
-      </w:r>
-      <w:r>
-        <w:rPr>
-          <w:rFonts w:ascii="Arial" w:hAnsi="Arial"/>
-          <w:b/>
-          <w:color w:val="15202B"/>
-          <w:sz w:val="21"/>
-        </w:rPr>
-        <w:t>Stop</w:t>
-      </w:r>
-      <w:r>
-        <w:rPr>
-          <w:rFonts w:ascii="Arial" w:hAnsi="Arial"/>
-          <w:b w:val="0"/>
-          <w:color w:val="15202B"/>
-          <w:sz w:val="21"/>
-        </w:rPr>
-        <w:t xml:space="preserve">, load the profile, then press </w:t>
-      </w:r>
-      <w:r>
-        <w:rPr>
-          <w:rFonts w:ascii="Arial" w:hAnsi="Arial"/>
-          <w:b/>
-          <w:color w:val="15202B"/>
-          <w:sz w:val="21"/>
-        </w:rPr>
-        <w:t>Start scanning + audio</w:t>
-      </w:r>
-      <w:r>
-        <w:rPr>
-          <w:rFonts w:ascii="Arial" w:hAnsi="Arial"/>
-          <w:b w:val="0"/>
-          <w:color w:val="15202B"/>
-          <w:sz w:val="21"/>
-        </w:rPr>
-        <w:t xml:space="preserve"> so OP25 regenerates and uses the selected system.</w:t>
-      </w:r>
-    </w:p>
-    <w:p>
-      <w:pPr>
-        <w:keepLines/>
-      </w:pPr>
-      <w:r>
-        <w:rPr>
-          <w:rFonts w:ascii="Arial" w:hAnsi="Arial"/>
-          <w:b w:val="0"/>
-          <w:color w:val="15202B"/>
-          <w:sz w:val="21"/>
-        </w:rPr>
-        <w:t xml:space="preserve">When scanning is running, the analog workers re-read their channel file between FFT sweeps. When scanning is stopped, an updated analog list becomes active the next time </w:t>
-      </w:r>
-      <w:r>
-        <w:rPr>
-          <w:rFonts w:ascii="Arial" w:hAnsi="Arial"/>
-          <w:b/>
-          <w:color w:val="15202B"/>
-          <w:sz w:val="21"/>
-        </w:rPr>
-        <w:t>Start scanning + audio</w:t>
-      </w:r>
-      <w:r>
-        <w:rPr>
-          <w:rFonts w:ascii="Arial" w:hAnsi="Arial"/>
-          <w:b w:val="0"/>
-          <w:color w:val="15202B"/>
-          <w:sz w:val="21"/>
-        </w:rPr>
-        <w:t xml:space="preserve"> is pressed.</w:t>
-      </w:r>
-    </w:p>
-    <w:p>
-      <w:pPr>
-        <w:pStyle w:val="Heading2"/>
-      </w:pPr>
-      <w:r>
-        <w:rPr>
-          <w:rFonts w:ascii="Arial" w:hAnsi="Arial"/>
-          <w:b/>
-          <w:color w:val="1565C0"/>
-          <w:sz w:val="28"/>
-        </w:rPr>
-        <w:t>Delete a profile</w:t>
-      </w:r>
-    </w:p>
-    <w:p>
-      <w:pPr>
-        <w:keepLines/>
-      </w:pPr>
-      <w:r>
-        <w:rPr>
-          <w:rFonts w:ascii="Arial" w:hAnsi="Arial"/>
-          <w:b w:val="0"/>
-          <w:color w:val="15202B"/>
-          <w:sz w:val="21"/>
-        </w:rPr>
-        <w:t xml:space="preserve">Select it and press </w:t>
-      </w:r>
-      <w:r>
-        <w:rPr>
-          <w:rFonts w:ascii="Arial" w:hAnsi="Arial"/>
-          <w:b/>
-          <w:color w:val="15202B"/>
-          <w:sz w:val="21"/>
-        </w:rPr>
-        <w:t>Delete Selected</w:t>
-      </w:r>
-      <w:r>
-        <w:rPr>
-          <w:rFonts w:ascii="Arial" w:hAnsi="Arial"/>
-          <w:b w:val="0"/>
-          <w:color w:val="15202B"/>
-          <w:sz w:val="21"/>
-        </w:rPr>
-        <w:t>. Deleting a saved profile does not by itself erase the currently active runtime configuration.</w:t>
-      </w:r>
-    </w:p>
-    <w:p>
-      <w:pPr>
-        <w:pStyle w:val="Heading2"/>
-      </w:pPr>
-      <w:r>
-        <w:rPr>
-          <w:rFonts w:ascii="Arial" w:hAnsi="Arial"/>
-          <w:b/>
-          <w:color w:val="1565C0"/>
-          <w:sz w:val="28"/>
-        </w:rPr>
-        <w:t>Name a profile during upload</w:t>
-      </w:r>
-    </w:p>
-    <w:p>
-      <w:pPr>
-        <w:keepLines/>
-      </w:pPr>
-      <w:r>
-        <w:rPr>
-          <w:rFonts w:ascii="Arial" w:hAnsi="Arial"/>
-          <w:b w:val="0"/>
-          <w:color w:val="15202B"/>
-          <w:sz w:val="21"/>
-        </w:rPr>
-        <w:t xml:space="preserve">Enter </w:t>
-      </w:r>
-      <w:r>
-        <w:rPr>
-          <w:rFonts w:ascii="Arial" w:hAnsi="Arial"/>
-          <w:b/>
-          <w:color w:val="15202B"/>
-          <w:sz w:val="21"/>
-        </w:rPr>
-        <w:t>New Profile Name</w:t>
-      </w:r>
-      <w:r>
-        <w:rPr>
-          <w:rFonts w:ascii="Arial" w:hAnsi="Arial"/>
-          <w:b w:val="0"/>
-          <w:color w:val="15202B"/>
-          <w:sz w:val="21"/>
-        </w:rPr>
-        <w:t xml:space="preserve"> before choosing or uploading the CSV. If the field is blank, N0JCG Scanner converts the CSV filename into the profile name.</w:t>
-      </w:r>
-    </w:p>
-    <w:p>
-      <w:pPr>
-        <w:pStyle w:val="Heading1"/>
-        <w:pBdr>
-          <w:bottom w:val="single" w:sz="8" w:space="4" w:color="00B8D9"/>
-        </w:pBdr>
-      </w:pPr>
-      <w:r>
-        <w:rPr>
-          <w:rFonts w:ascii="Arial" w:hAnsi="Arial"/>
-          <w:b/>
-          <w:color w:val="0A1F44"/>
-          <w:sz w:val="36"/>
-        </w:rPr>
-        <w:t>13. Import and export analog CHIRP CSV files</w:t>
-      </w:r>
-    </w:p>
-    <w:p>
-      <w:pPr>
-        <w:keepLines/>
-      </w:pPr>
-      <w:r>
-        <w:rPr>
-          <w:rFonts w:ascii="Arial" w:hAnsi="Arial"/>
-          <w:b w:val="0"/>
-          <w:color w:val="15202B"/>
-          <w:sz w:val="21"/>
-        </w:rPr>
-        <w:t xml:space="preserve">Use the </w:t>
-      </w:r>
-      <w:r>
-        <w:rPr>
-          <w:rFonts w:ascii="Arial" w:hAnsi="Arial"/>
-          <w:b/>
-          <w:color w:val="15202B"/>
-          <w:sz w:val="21"/>
-        </w:rPr>
-        <w:t>Analog VHF / UHF</w:t>
-      </w:r>
-      <w:r>
-        <w:rPr>
-          <w:rFonts w:ascii="Arial" w:hAnsi="Arial"/>
-          <w:b w:val="0"/>
-          <w:color w:val="15202B"/>
-          <w:sz w:val="21"/>
-        </w:rPr>
-        <w:t xml:space="preserve"> card on the Radio setup screen.</w:t>
       </w:r>
     </w:p>
     <w:p>
@@ -5250,7 +5440,7 @@
           <w:color w:val="15202B"/>
           <w:sz w:val="21"/>
         </w:rPr>
-        <w:t>Download Template</w:t>
+        <w:t>Save Current</w:t>
       </w:r>
       <w:r>
         <w:rPr>
@@ -5277,618 +5467,39 @@
           <w:color w:val="15202B"/>
           <w:sz w:val="21"/>
         </w:rPr>
-        <w:t>Edit the file in CHIRP, Excel, LibreOffice, or a text editor without changing the header names.</w:t>
+        <w:t xml:space="preserve">Press </w:t>
+      </w:r>
+      <w:r>
+        <w:rPr>
+          <w:rFonts w:ascii="Arial" w:hAnsi="Arial"/>
+          <w:b/>
+          <w:color w:val="15202B"/>
+          <w:sz w:val="21"/>
+        </w:rPr>
+        <w:t>Refresh Profiles</w:t>
+      </w:r>
+      <w:r>
+        <w:rPr>
+          <w:rFonts w:ascii="Arial" w:hAnsi="Arial"/>
+          <w:b w:val="0"/>
+          <w:color w:val="15202B"/>
+          <w:sz w:val="21"/>
+        </w:rPr>
+        <w:t xml:space="preserve"> if the new name does not appear immediately.</w:t>
       </w:r>
     </w:p>
     <w:p>
       <w:pPr>
-        <w:pStyle w:val="ListNumber"/>
-        <w:numPr>
-          <w:ilvl w:val="0"/>
-          <w:numId w:val="12"/>
-        </w:numPr>
-      </w:pPr>
-      <w:r>
-        <w:rPr>
-          <w:rFonts w:ascii="Arial" w:hAnsi="Arial"/>
-          <w:b w:val="0"/>
-          <w:color w:val="15202B"/>
-          <w:sz w:val="21"/>
-        </w:rPr>
-        <w:t xml:space="preserve">Enter the desired </w:t>
-      </w:r>
+        <w:pStyle w:val="Heading2"/>
+      </w:pPr>
       <w:r>
         <w:rPr>
           <w:rFonts w:ascii="Arial" w:hAnsi="Arial"/>
           <w:b/>
-          <w:color w:val="15202B"/>
-          <w:sz w:val="21"/>
-        </w:rPr>
-        <w:t>New Profile Name</w:t>
-      </w:r>
-      <w:r>
-        <w:rPr>
-          <w:rFonts w:ascii="Arial" w:hAnsi="Arial"/>
-          <w:b w:val="0"/>
-          <w:color w:val="15202B"/>
-          <w:sz w:val="21"/>
-        </w:rPr>
-        <w:t>.</w:t>
-      </w:r>
-    </w:p>
-    <w:p>
-      <w:pPr>
-        <w:pStyle w:val="ListNumber"/>
-        <w:numPr>
-          <w:ilvl w:val="0"/>
-          <w:numId w:val="12"/>
-        </w:numPr>
-      </w:pPr>
-      <w:r>
-        <w:rPr>
-          <w:rFonts w:ascii="Arial" w:hAnsi="Arial"/>
-          <w:b w:val="0"/>
-          <w:color w:val="15202B"/>
-          <w:sz w:val="21"/>
-        </w:rPr>
-        <w:t>Choose the CSV file.</w:t>
-      </w:r>
-    </w:p>
-    <w:p>
-      <w:pPr>
-        <w:pStyle w:val="ListNumber"/>
-        <w:numPr>
-          <w:ilvl w:val="0"/>
-          <w:numId w:val="12"/>
-        </w:numPr>
-      </w:pPr>
-      <w:r>
-        <w:rPr>
-          <w:rFonts w:ascii="Arial" w:hAnsi="Arial"/>
-          <w:b w:val="0"/>
-          <w:color w:val="15202B"/>
-          <w:sz w:val="21"/>
-        </w:rPr>
-        <w:t xml:space="preserve">Press </w:t>
-      </w:r>
-      <w:r>
-        <w:rPr>
-          <w:rFonts w:ascii="Arial" w:hAnsi="Arial"/>
-          <w:b/>
-          <w:color w:val="15202B"/>
-          <w:sz w:val="21"/>
-        </w:rPr>
-        <w:t>Upload &amp; Save Profile</w:t>
-      </w:r>
-      <w:r>
-        <w:rPr>
-          <w:rFonts w:ascii="Arial" w:hAnsi="Arial"/>
-          <w:b w:val="0"/>
-          <w:color w:val="15202B"/>
-          <w:sz w:val="21"/>
-        </w:rPr>
-        <w:t>.</w:t>
-      </w:r>
-    </w:p>
-    <w:p>
-      <w:pPr>
-        <w:pStyle w:val="ListNumber"/>
-        <w:numPr>
-          <w:ilvl w:val="0"/>
-          <w:numId w:val="12"/>
-        </w:numPr>
-      </w:pPr>
-      <w:r>
-        <w:rPr>
-          <w:rFonts w:ascii="Arial" w:hAnsi="Arial"/>
-          <w:b w:val="0"/>
-          <w:color w:val="15202B"/>
-          <w:sz w:val="21"/>
-        </w:rPr>
-        <w:t>Confirm the displayed VHF/UHF channel counts.</w:t>
-      </w:r>
-    </w:p>
-    <w:p>
-      <w:pPr>
-        <w:keepLines/>
-      </w:pPr>
-      <w:r>
-        <w:rPr>
-          <w:rFonts w:ascii="Arial" w:hAnsi="Arial"/>
-          <w:b w:val="0"/>
-          <w:color w:val="15202B"/>
-          <w:sz w:val="21"/>
-        </w:rPr>
-        <w:t xml:space="preserve">Required CHIRP columns are </w:t>
-      </w:r>
-      <w:r>
-        <w:rPr>
-          <w:rFonts w:ascii="Consolas" w:hAnsi="Consolas"/>
-          <w:b w:val="0"/>
-          <w:color w:val="0A1F44"/>
-          <w:sz w:val="20"/>
-          <w:shd w:fill="EEF5FC"/>
-        </w:rPr>
-        <w:t>Location</w:t>
-      </w:r>
-      <w:r>
-        <w:rPr>
-          <w:rFonts w:ascii="Arial" w:hAnsi="Arial"/>
-          <w:b w:val="0"/>
-          <w:color w:val="15202B"/>
-          <w:sz w:val="21"/>
-        </w:rPr>
-        <w:t xml:space="preserve">, </w:t>
-      </w:r>
-      <w:r>
-        <w:rPr>
-          <w:rFonts w:ascii="Consolas" w:hAnsi="Consolas"/>
-          <w:b w:val="0"/>
-          <w:color w:val="0A1F44"/>
-          <w:sz w:val="20"/>
-          <w:shd w:fill="EEF5FC"/>
-        </w:rPr>
-        <w:t>Name</w:t>
-      </w:r>
-      <w:r>
-        <w:rPr>
-          <w:rFonts w:ascii="Arial" w:hAnsi="Arial"/>
-          <w:b w:val="0"/>
-          <w:color w:val="15202B"/>
-          <w:sz w:val="21"/>
-        </w:rPr>
-        <w:t xml:space="preserve">, </w:t>
-      </w:r>
-      <w:r>
-        <w:rPr>
-          <w:rFonts w:ascii="Consolas" w:hAnsi="Consolas"/>
-          <w:b w:val="0"/>
-          <w:color w:val="0A1F44"/>
-          <w:sz w:val="20"/>
-          <w:shd w:fill="EEF5FC"/>
-        </w:rPr>
-        <w:t>Frequency</w:t>
-      </w:r>
-      <w:r>
-        <w:rPr>
-          <w:rFonts w:ascii="Arial" w:hAnsi="Arial"/>
-          <w:b w:val="0"/>
-          <w:color w:val="15202B"/>
-          <w:sz w:val="21"/>
-        </w:rPr>
-        <w:t xml:space="preserve">, and </w:t>
-      </w:r>
-      <w:r>
-        <w:rPr>
-          <w:rFonts w:ascii="Consolas" w:hAnsi="Consolas"/>
-          <w:b w:val="0"/>
-          <w:color w:val="0A1F44"/>
-          <w:sz w:val="20"/>
-          <w:shd w:fill="EEF5FC"/>
-        </w:rPr>
-        <w:t>Mode</w:t>
-      </w:r>
-      <w:r>
-        <w:rPr>
-          <w:rFonts w:ascii="Arial" w:hAnsi="Arial"/>
-          <w:b w:val="0"/>
-          <w:color w:val="15202B"/>
-          <w:sz w:val="21"/>
-        </w:rPr>
-        <w:t>. The downloaded template includes the full standard CHIRP column set.</w:t>
-      </w:r>
-    </w:p>
-    <w:p>
-      <w:pPr>
-        <w:keepLines/>
-      </w:pPr>
-      <w:r>
-        <w:rPr>
-          <w:rFonts w:ascii="Arial" w:hAnsi="Arial"/>
-          <w:b w:val="0"/>
-          <w:color w:val="15202B"/>
-          <w:sz w:val="21"/>
-        </w:rPr>
-        <w:t>Import behavior:</w:t>
-      </w:r>
-    </w:p>
-    <w:p>
-      <w:pPr>
-        <w:pStyle w:val="ListBullet"/>
-      </w:pPr>
-      <w:r>
-        <w:rPr>
-          <w:rFonts w:ascii="Arial" w:hAnsi="Arial"/>
-          <w:b w:val="0"/>
-          <w:color w:val="15202B"/>
-          <w:sz w:val="21"/>
-        </w:rPr>
-        <w:t xml:space="preserve">136–174 MHz channels are assigned to VHF / </w:t>
-      </w:r>
-      <w:r>
-        <w:rPr>
-          <w:rFonts w:ascii="Consolas" w:hAnsi="Consolas"/>
-          <w:b w:val="0"/>
-          <w:color w:val="0A1F44"/>
-          <w:sz w:val="20"/>
-          <w:shd w:fill="EEF5FC"/>
-        </w:rPr>
-        <w:t>analog_2m</w:t>
-      </w:r>
-      <w:r>
-        <w:rPr>
-          <w:rFonts w:ascii="Arial" w:hAnsi="Arial"/>
-          <w:b w:val="0"/>
-          <w:color w:val="15202B"/>
-          <w:sz w:val="21"/>
-        </w:rPr>
-        <w:t xml:space="preserve"> / </w:t>
-      </w:r>
-      <w:r>
-        <w:rPr>
-          <w:rFonts w:ascii="Consolas" w:hAnsi="Consolas"/>
-          <w:b w:val="0"/>
-          <w:color w:val="0A1F44"/>
-          <w:sz w:val="20"/>
-          <w:shd w:fill="EEF5FC"/>
-        </w:rPr>
-        <w:t>&lt;VHF_SERIAL&gt;</w:t>
-      </w:r>
-      <w:r>
-        <w:rPr>
-          <w:rFonts w:ascii="Arial" w:hAnsi="Arial"/>
-          <w:b w:val="0"/>
-          <w:color w:val="15202B"/>
-          <w:sz w:val="21"/>
-        </w:rPr>
-        <w:t>.</w:t>
-      </w:r>
-    </w:p>
-    <w:p>
-      <w:pPr>
-        <w:pStyle w:val="ListBullet"/>
-      </w:pPr>
-      <w:r>
-        <w:rPr>
-          <w:rFonts w:ascii="Arial" w:hAnsi="Arial"/>
-          <w:b w:val="0"/>
-          <w:color w:val="15202B"/>
-          <w:sz w:val="21"/>
-        </w:rPr>
-        <w:t xml:space="preserve">400–520 MHz channels are assigned to UHF / </w:t>
-      </w:r>
-      <w:r>
-        <w:rPr>
-          <w:rFonts w:ascii="Consolas" w:hAnsi="Consolas"/>
-          <w:b w:val="0"/>
-          <w:color w:val="0A1F44"/>
-          <w:sz w:val="20"/>
-          <w:shd w:fill="EEF5FC"/>
-        </w:rPr>
-        <w:t>analog_70cm</w:t>
-      </w:r>
-      <w:r>
-        <w:rPr>
-          <w:rFonts w:ascii="Arial" w:hAnsi="Arial"/>
-          <w:b w:val="0"/>
-          <w:color w:val="15202B"/>
-          <w:sz w:val="21"/>
-        </w:rPr>
-        <w:t xml:space="preserve"> / </w:t>
-      </w:r>
-      <w:r>
-        <w:rPr>
-          <w:rFonts w:ascii="Consolas" w:hAnsi="Consolas"/>
-          <w:b w:val="0"/>
-          <w:color w:val="0A1F44"/>
-          <w:sz w:val="20"/>
-          <w:shd w:fill="EEF5FC"/>
-        </w:rPr>
-        <w:t>&lt;UHF_SERIAL&gt;</w:t>
-      </w:r>
-      <w:r>
-        <w:rPr>
-          <w:rFonts w:ascii="Arial" w:hAnsi="Arial"/>
-          <w:b w:val="0"/>
-          <w:color w:val="15202B"/>
-          <w:sz w:val="21"/>
-        </w:rPr>
-        <w:t>.</w:t>
-      </w:r>
-    </w:p>
-    <w:p>
-      <w:pPr>
-        <w:pStyle w:val="ListBullet"/>
-      </w:pPr>
-      <w:r>
-        <w:rPr>
-          <w:rFonts w:ascii="Consolas" w:hAnsi="Consolas"/>
-          <w:b w:val="0"/>
-          <w:color w:val="0A1F44"/>
-          <w:sz w:val="20"/>
-          <w:shd w:fill="EEF5FC"/>
-        </w:rPr>
-        <w:t>FM</w:t>
-      </w:r>
-      <w:r>
-        <w:rPr>
-          <w:rFonts w:ascii="Arial" w:hAnsi="Arial"/>
-          <w:b w:val="0"/>
-          <w:color w:val="15202B"/>
-          <w:sz w:val="21"/>
-        </w:rPr>
-        <w:t xml:space="preserve"> and </w:t>
-      </w:r>
-      <w:r>
-        <w:rPr>
-          <w:rFonts w:ascii="Consolas" w:hAnsi="Consolas"/>
-          <w:b w:val="0"/>
-          <w:color w:val="0A1F44"/>
-          <w:sz w:val="20"/>
-          <w:shd w:fill="EEF5FC"/>
-        </w:rPr>
-        <w:t>NFM</w:t>
-      </w:r>
-      <w:r>
-        <w:rPr>
-          <w:rFonts w:ascii="Arial" w:hAnsi="Arial"/>
-          <w:b w:val="0"/>
-          <w:color w:val="15202B"/>
-          <w:sz w:val="21"/>
-        </w:rPr>
-        <w:t xml:space="preserve"> are accepted and normalized for the NFM scanner path.</w:t>
-      </w:r>
-    </w:p>
-    <w:p>
-      <w:pPr>
-        <w:pStyle w:val="ListBullet"/>
-      </w:pPr>
-      <w:r>
-        <w:rPr>
-          <w:rFonts w:ascii="Consolas" w:hAnsi="Consolas"/>
-          <w:b w:val="0"/>
-          <w:color w:val="0A1F44"/>
-          <w:sz w:val="20"/>
-          <w:shd w:fill="EEF5FC"/>
-        </w:rPr>
-        <w:t>Skip</w:t>
-      </w:r>
-      <w:r>
-        <w:rPr>
-          <w:rFonts w:ascii="Arial" w:hAnsi="Arial"/>
-          <w:b w:val="0"/>
-          <w:color w:val="15202B"/>
-          <w:sz w:val="21"/>
-        </w:rPr>
-        <w:t xml:space="preserve"> values </w:t>
-      </w:r>
-      <w:r>
-        <w:rPr>
-          <w:rFonts w:ascii="Consolas" w:hAnsi="Consolas"/>
-          <w:b w:val="0"/>
-          <w:color w:val="0A1F44"/>
-          <w:sz w:val="20"/>
-          <w:shd w:fill="EEF5FC"/>
-        </w:rPr>
-        <w:t>S</w:t>
-      </w:r>
-      <w:r>
-        <w:rPr>
-          <w:rFonts w:ascii="Arial" w:hAnsi="Arial"/>
-          <w:b w:val="0"/>
-          <w:color w:val="15202B"/>
-          <w:sz w:val="21"/>
-        </w:rPr>
-        <w:t xml:space="preserve"> or </w:t>
-      </w:r>
-      <w:r>
-        <w:rPr>
-          <w:rFonts w:ascii="Consolas" w:hAnsi="Consolas"/>
-          <w:b w:val="0"/>
-          <w:color w:val="0A1F44"/>
-          <w:sz w:val="20"/>
-          <w:shd w:fill="EEF5FC"/>
-        </w:rPr>
-        <w:t>L</w:t>
-      </w:r>
-      <w:r>
-        <w:rPr>
-          <w:rFonts w:ascii="Arial" w:hAnsi="Arial"/>
-          <w:b w:val="0"/>
-          <w:color w:val="15202B"/>
-          <w:sz w:val="21"/>
-        </w:rPr>
-        <w:t xml:space="preserve"> import the row as disabled.</w:t>
-      </w:r>
-    </w:p>
-    <w:p>
-      <w:pPr>
-        <w:pStyle w:val="ListBullet"/>
-      </w:pPr>
-      <w:r>
-        <w:rPr>
-          <w:rFonts w:ascii="Arial" w:hAnsi="Arial"/>
-          <w:b w:val="0"/>
-          <w:color w:val="15202B"/>
-          <w:sz w:val="21"/>
-        </w:rPr>
-        <w:t xml:space="preserve">CHIRP </w:t>
-      </w:r>
-      <w:r>
-        <w:rPr>
-          <w:rFonts w:ascii="Consolas" w:hAnsi="Consolas"/>
-          <w:b w:val="0"/>
-          <w:color w:val="0A1F44"/>
-          <w:sz w:val="20"/>
-          <w:shd w:fill="EEF5FC"/>
-        </w:rPr>
-        <w:t>Tone</w:t>
-      </w:r>
-      <w:r>
-        <w:rPr>
-          <w:rFonts w:ascii="Arial" w:hAnsi="Arial"/>
-          <w:b w:val="0"/>
-          <w:color w:val="15202B"/>
-          <w:sz w:val="21"/>
-        </w:rPr>
-        <w:t xml:space="preserve"> by itself is transmit-only and does not enable receive gating.</w:t>
-      </w:r>
-    </w:p>
-    <w:p>
-      <w:pPr>
-        <w:pStyle w:val="ListBullet"/>
-      </w:pPr>
-      <w:r>
-        <w:rPr>
-          <w:rFonts w:ascii="Consolas" w:hAnsi="Consolas"/>
-          <w:b w:val="0"/>
-          <w:color w:val="0A1F44"/>
-          <w:sz w:val="20"/>
-          <w:shd w:fill="EEF5FC"/>
-        </w:rPr>
-        <w:t>TSQL</w:t>
-      </w:r>
-      <w:r>
-        <w:rPr>
-          <w:rFonts w:ascii="Arial" w:hAnsi="Arial"/>
-          <w:b w:val="0"/>
-          <w:color w:val="15202B"/>
-          <w:sz w:val="21"/>
-        </w:rPr>
-        <w:t xml:space="preserve">, </w:t>
-      </w:r>
-      <w:r>
-        <w:rPr>
-          <w:rFonts w:ascii="Consolas" w:hAnsi="Consolas"/>
-          <w:b w:val="0"/>
-          <w:color w:val="0A1F44"/>
-          <w:sz w:val="20"/>
-          <w:shd w:fill="EEF5FC"/>
-        </w:rPr>
-        <w:t>TSQL-R</w:t>
-      </w:r>
-      <w:r>
-        <w:rPr>
-          <w:rFonts w:ascii="Arial" w:hAnsi="Arial"/>
-          <w:b w:val="0"/>
-          <w:color w:val="15202B"/>
-          <w:sz w:val="21"/>
-        </w:rPr>
-        <w:t xml:space="preserve">, or a compatible cross mode uses </w:t>
-      </w:r>
-      <w:r>
-        <w:rPr>
-          <w:rFonts w:ascii="Consolas" w:hAnsi="Consolas"/>
-          <w:b w:val="0"/>
-          <w:color w:val="0A1F44"/>
-          <w:sz w:val="20"/>
-          <w:shd w:fill="EEF5FC"/>
-        </w:rPr>
-        <w:t>cToneFreq</w:t>
-      </w:r>
-      <w:r>
-        <w:rPr>
-          <w:rFonts w:ascii="Arial" w:hAnsi="Arial"/>
-          <w:b w:val="0"/>
-          <w:color w:val="15202B"/>
-          <w:sz w:val="21"/>
-        </w:rPr>
-        <w:t xml:space="preserve"> as a receive CTCSS gate.</w:t>
-      </w:r>
-    </w:p>
-    <w:p>
-      <w:pPr>
-        <w:pStyle w:val="ListBullet"/>
-      </w:pPr>
-      <w:r>
-        <w:rPr>
-          <w:rFonts w:ascii="Arial" w:hAnsi="Arial"/>
-          <w:b w:val="0"/>
-          <w:color w:val="15202B"/>
-          <w:sz w:val="21"/>
-        </w:rPr>
-        <w:t>A file containing only one band replaces only that band and preserves the other active band.</w:t>
-      </w:r>
-    </w:p>
-    <w:p>
-      <w:pPr>
-        <w:keepLines/>
-      </w:pPr>
-      <w:r>
-        <w:rPr>
-          <w:rFonts w:ascii="Arial" w:hAnsi="Arial"/>
-          <w:b w:val="0"/>
-          <w:color w:val="15202B"/>
-          <w:sz w:val="21"/>
-        </w:rPr>
-        <w:t xml:space="preserve">To back up a named analog profile, select it and press </w:t>
-      </w:r>
-      <w:r>
-        <w:rPr>
-          <w:rFonts w:ascii="Arial" w:hAnsi="Arial"/>
-          <w:b/>
-          <w:color w:val="15202B"/>
-          <w:sz w:val="21"/>
-        </w:rPr>
-        <w:t>Export Selected</w:t>
-      </w:r>
-      <w:r>
-        <w:rPr>
-          <w:rFonts w:ascii="Arial" w:hAnsi="Arial"/>
-          <w:b w:val="0"/>
-          <w:color w:val="15202B"/>
-          <w:sz w:val="21"/>
-        </w:rPr>
-        <w:t>.</w:t>
-      </w:r>
-    </w:p>
-    <w:p>
-      <w:pPr>
-        <w:pStyle w:val="Heading1"/>
-        <w:pBdr>
-          <w:bottom w:val="single" w:sz="8" w:space="4" w:color="00B8D9"/>
-        </w:pBdr>
-      </w:pPr>
-      <w:r>
-        <w:rPr>
-          <w:rFonts w:ascii="Arial" w:hAnsi="Arial"/>
-          <w:b/>
-          <w:color w:val="0A1F44"/>
-          <w:sz w:val="36"/>
-        </w:rPr>
-        <w:t>14. Import and export P25 CSV files</w:t>
-      </w:r>
-    </w:p>
-    <w:p>
-      <w:pPr>
-        <w:keepLines/>
-      </w:pPr>
-      <w:r>
-        <w:rPr>
-          <w:rFonts w:ascii="Arial" w:hAnsi="Arial"/>
-          <w:b w:val="0"/>
-          <w:color w:val="15202B"/>
-          <w:sz w:val="21"/>
-        </w:rPr>
-        <w:t xml:space="preserve">Use the </w:t>
-      </w:r>
-      <w:r>
-        <w:rPr>
-          <w:rFonts w:ascii="Arial" w:hAnsi="Arial"/>
-          <w:b/>
-          <w:color w:val="15202B"/>
-          <w:sz w:val="21"/>
-        </w:rPr>
-        <w:t>P25 Systems &amp; Talkgroups</w:t>
-      </w:r>
-      <w:r>
-        <w:rPr>
-          <w:rFonts w:ascii="Arial" w:hAnsi="Arial"/>
-          <w:b w:val="0"/>
-          <w:color w:val="15202B"/>
-          <w:sz w:val="21"/>
-        </w:rPr>
-        <w:t xml:space="preserve"> card on the Radio setup screen.</w:t>
+          <w:color w:val="1565C0"/>
+          <w:sz w:val="28"/>
+        </w:rPr>
+        <w:t>Load a profile</w:t>
       </w:r>
     </w:p>
     <w:p>
@@ -5906,7 +5517,7 @@
           <w:color w:val="15202B"/>
           <w:sz w:val="21"/>
         </w:rPr>
-        <w:t xml:space="preserve">Press </w:t>
+        <w:t xml:space="preserve">Select it under </w:t>
       </w:r>
       <w:r>
         <w:rPr>
@@ -5915,7 +5526,7 @@
           <w:color w:val="15202B"/>
           <w:sz w:val="21"/>
         </w:rPr>
-        <w:t>Download Template</w:t>
+        <w:t>Saved Profile</w:t>
       </w:r>
       <w:r>
         <w:rPr>
@@ -5942,7 +5553,25 @@
           <w:color w:val="15202B"/>
           <w:sz w:val="21"/>
         </w:rPr>
-        <w:t>Enter one row per control frequency, optional voice frequency, or talkgroup.</w:t>
+        <w:t xml:space="preserve">Press </w:t>
+      </w:r>
+      <w:r>
+        <w:rPr>
+          <w:rFonts w:ascii="Arial" w:hAnsi="Arial"/>
+          <w:b/>
+          <w:color w:val="15202B"/>
+          <w:sz w:val="21"/>
+        </w:rPr>
+        <w:t>Load Selected Profile</w:t>
+      </w:r>
+      <w:r>
+        <w:rPr>
+          <w:rFonts w:ascii="Arial" w:hAnsi="Arial"/>
+          <w:b w:val="0"/>
+          <w:color w:val="15202B"/>
+          <w:sz w:val="21"/>
+        </w:rPr>
+        <w:t>.</w:t>
       </w:r>
     </w:p>
     <w:p>
@@ -5960,7 +5589,7 @@
           <w:color w:val="15202B"/>
           <w:sz w:val="21"/>
         </w:rPr>
-        <w:t xml:space="preserve">Enter a </w:t>
+        <w:t xml:space="preserve">For a P25 system change, press </w:t>
       </w:r>
       <w:r>
         <w:rPr>
@@ -5969,6 +5598,148 @@
           <w:color w:val="15202B"/>
           <w:sz w:val="21"/>
         </w:rPr>
+        <w:t>Stop</w:t>
+      </w:r>
+      <w:r>
+        <w:rPr>
+          <w:rFonts w:ascii="Arial" w:hAnsi="Arial"/>
+          <w:b w:val="0"/>
+          <w:color w:val="15202B"/>
+          <w:sz w:val="21"/>
+        </w:rPr>
+        <w:t xml:space="preserve">, load the profile, then press </w:t>
+      </w:r>
+      <w:r>
+        <w:rPr>
+          <w:rFonts w:ascii="Arial" w:hAnsi="Arial"/>
+          <w:b/>
+          <w:color w:val="15202B"/>
+          <w:sz w:val="21"/>
+        </w:rPr>
+        <w:t>Start scanning + audio</w:t>
+      </w:r>
+      <w:r>
+        <w:rPr>
+          <w:rFonts w:ascii="Arial" w:hAnsi="Arial"/>
+          <w:b w:val="0"/>
+          <w:color w:val="15202B"/>
+          <w:sz w:val="21"/>
+        </w:rPr>
+        <w:t xml:space="preserve"> so OP25 regenerates and uses the selected system.</w:t>
+      </w:r>
+    </w:p>
+    <w:p>
+      <w:pPr>
+        <w:keepLines/>
+      </w:pPr>
+      <w:r>
+        <w:rPr>
+          <w:rFonts w:ascii="Arial" w:hAnsi="Arial"/>
+          <w:b w:val="0"/>
+          <w:color w:val="15202B"/>
+          <w:sz w:val="21"/>
+        </w:rPr>
+        <w:t xml:space="preserve">When scanning is running, the analog workers re-read their channel file between FFT sweeps. When scanning is stopped, an updated analog list becomes active the next time </w:t>
+      </w:r>
+      <w:r>
+        <w:rPr>
+          <w:rFonts w:ascii="Arial" w:hAnsi="Arial"/>
+          <w:b/>
+          <w:color w:val="15202B"/>
+          <w:sz w:val="21"/>
+        </w:rPr>
+        <w:t>Start scanning + audio</w:t>
+      </w:r>
+      <w:r>
+        <w:rPr>
+          <w:rFonts w:ascii="Arial" w:hAnsi="Arial"/>
+          <w:b w:val="0"/>
+          <w:color w:val="15202B"/>
+          <w:sz w:val="21"/>
+        </w:rPr>
+        <w:t xml:space="preserve"> is pressed.</w:t>
+      </w:r>
+    </w:p>
+    <w:p>
+      <w:pPr>
+        <w:pStyle w:val="Heading2"/>
+      </w:pPr>
+      <w:r>
+        <w:rPr>
+          <w:rFonts w:ascii="Arial" w:hAnsi="Arial"/>
+          <w:b/>
+          <w:color w:val="1565C0"/>
+          <w:sz w:val="28"/>
+        </w:rPr>
+        <w:t>Delete a profile</w:t>
+      </w:r>
+    </w:p>
+    <w:p>
+      <w:pPr>
+        <w:keepLines/>
+      </w:pPr>
+      <w:r>
+        <w:rPr>
+          <w:rFonts w:ascii="Arial" w:hAnsi="Arial"/>
+          <w:b w:val="0"/>
+          <w:color w:val="15202B"/>
+          <w:sz w:val="21"/>
+        </w:rPr>
+        <w:t xml:space="preserve">Select it and press </w:t>
+      </w:r>
+      <w:r>
+        <w:rPr>
+          <w:rFonts w:ascii="Arial" w:hAnsi="Arial"/>
+          <w:b/>
+          <w:color w:val="15202B"/>
+          <w:sz w:val="21"/>
+        </w:rPr>
+        <w:t>Delete Selected</w:t>
+      </w:r>
+      <w:r>
+        <w:rPr>
+          <w:rFonts w:ascii="Arial" w:hAnsi="Arial"/>
+          <w:b w:val="0"/>
+          <w:color w:val="15202B"/>
+          <w:sz w:val="21"/>
+        </w:rPr>
+        <w:t>. Deleting a saved profile does not by itself erase the currently active runtime configuration.</w:t>
+      </w:r>
+    </w:p>
+    <w:p>
+      <w:pPr>
+        <w:pStyle w:val="Heading2"/>
+      </w:pPr>
+      <w:r>
+        <w:rPr>
+          <w:rFonts w:ascii="Arial" w:hAnsi="Arial"/>
+          <w:b/>
+          <w:color w:val="1565C0"/>
+          <w:sz w:val="28"/>
+        </w:rPr>
+        <w:t>Name a profile during upload</w:t>
+      </w:r>
+    </w:p>
+    <w:p>
+      <w:pPr>
+        <w:keepLines/>
+      </w:pPr>
+      <w:r>
+        <w:rPr>
+          <w:rFonts w:ascii="Arial" w:hAnsi="Arial"/>
+          <w:b w:val="0"/>
+          <w:color w:val="15202B"/>
+          <w:sz w:val="21"/>
+        </w:rPr>
+        <w:t xml:space="preserve">Enter </w:t>
+      </w:r>
+      <w:r>
+        <w:rPr>
+          <w:rFonts w:ascii="Arial" w:hAnsi="Arial"/>
+          <w:b/>
+          <w:color w:val="15202B"/>
+          <w:sz w:val="21"/>
+        </w:rPr>
         <w:t>New Profile Name</w:t>
       </w:r>
       <w:r>
@@ -5978,7 +5749,56 @@
           <w:color w:val="15202B"/>
           <w:sz w:val="21"/>
         </w:rPr>
-        <w:t>.</w:t>
+        <w:t xml:space="preserve"> before choosing or uploading the CSV. If the field is blank, N0JCG Scanner converts the CSV filename into the profile name.</w:t>
+      </w:r>
+    </w:p>
+    <w:p>
+      <w:pPr>
+        <w:pStyle w:val="Heading1"/>
+        <w:pBdr>
+          <w:bottom w:val="single" w:sz="8" w:space="4" w:color="00B8D9"/>
+        </w:pBdr>
+      </w:pPr>
+      <w:r>
+        <w:rPr>
+          <w:rFonts w:ascii="Arial" w:hAnsi="Arial"/>
+          <w:b/>
+          <w:color w:val="0A1F44"/>
+          <w:sz w:val="36"/>
+        </w:rPr>
+        <w:t>13. Import and export analog CHIRP CSV files</w:t>
+      </w:r>
+    </w:p>
+    <w:p>
+      <w:pPr>
+        <w:keepLines/>
+      </w:pPr>
+      <w:r>
+        <w:rPr>
+          <w:rFonts w:ascii="Arial" w:hAnsi="Arial"/>
+          <w:b w:val="0"/>
+          <w:color w:val="15202B"/>
+          <w:sz w:val="21"/>
+        </w:rPr>
+        <w:t xml:space="preserve">Use the </w:t>
+      </w:r>
+      <w:r>
+        <w:rPr>
+          <w:rFonts w:ascii="Arial" w:hAnsi="Arial"/>
+          <w:b/>
+          <w:color w:val="15202B"/>
+          <w:sz w:val="21"/>
+        </w:rPr>
+        <w:t>Analog VHF / UHF</w:t>
+      </w:r>
+      <w:r>
+        <w:rPr>
+          <w:rFonts w:ascii="Arial" w:hAnsi="Arial"/>
+          <w:b w:val="0"/>
+          <w:color w:val="15202B"/>
+          <w:sz w:val="21"/>
+        </w:rPr>
+        <w:t xml:space="preserve"> card on the Radio setup screen.</w:t>
       </w:r>
     </w:p>
     <w:p>
@@ -5986,7 +5806,7 @@
         <w:pStyle w:val="ListNumber"/>
         <w:numPr>
           <w:ilvl w:val="0"/>
-          <w:numId w:val="13"/>
+          <w:numId w:val="14"/>
         </w:numPr>
       </w:pPr>
       <w:r>
@@ -5996,7 +5816,7 @@
           <w:color w:val="15202B"/>
           <w:sz w:val="21"/>
         </w:rPr>
-        <w:t xml:space="preserve">Choose the CSV and press </w:t>
+        <w:t xml:space="preserve">Press </w:t>
       </w:r>
       <w:r>
         <w:rPr>
@@ -6005,7 +5825,7 @@
           <w:color w:val="15202B"/>
           <w:sz w:val="21"/>
         </w:rPr>
-        <w:t>Upload &amp; Save Profile</w:t>
+        <w:t>Download Template</w:t>
       </w:r>
       <w:r>
         <w:rPr>
@@ -6022,7 +5842,762 @@
         <w:pStyle w:val="ListNumber"/>
         <w:numPr>
           <w:ilvl w:val="0"/>
-          <w:numId w:val="13"/>
+          <w:numId w:val="14"/>
+        </w:numPr>
+      </w:pPr>
+      <w:r>
+        <w:rPr>
+          <w:rFonts w:ascii="Arial" w:hAnsi="Arial"/>
+          <w:b w:val="0"/>
+          <w:color w:val="15202B"/>
+          <w:sz w:val="21"/>
+        </w:rPr>
+        <w:t>Edit the file in CHIRP, Excel, LibreOffice, or a text editor without changing the header names.</w:t>
+      </w:r>
+    </w:p>
+    <w:p>
+      <w:pPr>
+        <w:pStyle w:val="ListNumber"/>
+        <w:numPr>
+          <w:ilvl w:val="0"/>
+          <w:numId w:val="14"/>
+        </w:numPr>
+      </w:pPr>
+      <w:r>
+        <w:rPr>
+          <w:rFonts w:ascii="Arial" w:hAnsi="Arial"/>
+          <w:b w:val="0"/>
+          <w:color w:val="15202B"/>
+          <w:sz w:val="21"/>
+        </w:rPr>
+        <w:t xml:space="preserve">Enter the desired </w:t>
+      </w:r>
+      <w:r>
+        <w:rPr>
+          <w:rFonts w:ascii="Arial" w:hAnsi="Arial"/>
+          <w:b/>
+          <w:color w:val="15202B"/>
+          <w:sz w:val="21"/>
+        </w:rPr>
+        <w:t>New Profile Name</w:t>
+      </w:r>
+      <w:r>
+        <w:rPr>
+          <w:rFonts w:ascii="Arial" w:hAnsi="Arial"/>
+          <w:b w:val="0"/>
+          <w:color w:val="15202B"/>
+          <w:sz w:val="21"/>
+        </w:rPr>
+        <w:t>.</w:t>
+      </w:r>
+    </w:p>
+    <w:p>
+      <w:pPr>
+        <w:pStyle w:val="ListNumber"/>
+        <w:numPr>
+          <w:ilvl w:val="0"/>
+          <w:numId w:val="14"/>
+        </w:numPr>
+      </w:pPr>
+      <w:r>
+        <w:rPr>
+          <w:rFonts w:ascii="Arial" w:hAnsi="Arial"/>
+          <w:b w:val="0"/>
+          <w:color w:val="15202B"/>
+          <w:sz w:val="21"/>
+        </w:rPr>
+        <w:t>Choose the CSV file.</w:t>
+      </w:r>
+    </w:p>
+    <w:p>
+      <w:pPr>
+        <w:pStyle w:val="ListNumber"/>
+        <w:numPr>
+          <w:ilvl w:val="0"/>
+          <w:numId w:val="14"/>
+        </w:numPr>
+      </w:pPr>
+      <w:r>
+        <w:rPr>
+          <w:rFonts w:ascii="Arial" w:hAnsi="Arial"/>
+          <w:b w:val="0"/>
+          <w:color w:val="15202B"/>
+          <w:sz w:val="21"/>
+        </w:rPr>
+        <w:t xml:space="preserve">Press </w:t>
+      </w:r>
+      <w:r>
+        <w:rPr>
+          <w:rFonts w:ascii="Arial" w:hAnsi="Arial"/>
+          <w:b/>
+          <w:color w:val="15202B"/>
+          <w:sz w:val="21"/>
+        </w:rPr>
+        <w:t>Upload &amp; Save Profile</w:t>
+      </w:r>
+      <w:r>
+        <w:rPr>
+          <w:rFonts w:ascii="Arial" w:hAnsi="Arial"/>
+          <w:b w:val="0"/>
+          <w:color w:val="15202B"/>
+          <w:sz w:val="21"/>
+        </w:rPr>
+        <w:t>.</w:t>
+      </w:r>
+    </w:p>
+    <w:p>
+      <w:pPr>
+        <w:pStyle w:val="ListNumber"/>
+        <w:numPr>
+          <w:ilvl w:val="0"/>
+          <w:numId w:val="14"/>
+        </w:numPr>
+      </w:pPr>
+      <w:r>
+        <w:rPr>
+          <w:rFonts w:ascii="Arial" w:hAnsi="Arial"/>
+          <w:b w:val="0"/>
+          <w:color w:val="15202B"/>
+          <w:sz w:val="21"/>
+        </w:rPr>
+        <w:t>Confirm the displayed VHF/UHF channel counts.</w:t>
+      </w:r>
+    </w:p>
+    <w:p>
+      <w:pPr>
+        <w:keepLines/>
+      </w:pPr>
+      <w:r>
+        <w:rPr>
+          <w:rFonts w:ascii="Arial" w:hAnsi="Arial"/>
+          <w:b w:val="0"/>
+          <w:color w:val="15202B"/>
+          <w:sz w:val="21"/>
+        </w:rPr>
+        <w:t xml:space="preserve">Required CHIRP columns are </w:t>
+      </w:r>
+      <w:r>
+        <w:rPr>
+          <w:rFonts w:ascii="Consolas" w:hAnsi="Consolas"/>
+          <w:b w:val="0"/>
+          <w:color w:val="0A1F44"/>
+          <w:sz w:val="20"/>
+          <w:shd w:fill="EEF5FC"/>
+        </w:rPr>
+        <w:t>Location</w:t>
+      </w:r>
+      <w:r>
+        <w:rPr>
+          <w:rFonts w:ascii="Arial" w:hAnsi="Arial"/>
+          <w:b w:val="0"/>
+          <w:color w:val="15202B"/>
+          <w:sz w:val="21"/>
+        </w:rPr>
+        <w:t xml:space="preserve">, </w:t>
+      </w:r>
+      <w:r>
+        <w:rPr>
+          <w:rFonts w:ascii="Consolas" w:hAnsi="Consolas"/>
+          <w:b w:val="0"/>
+          <w:color w:val="0A1F44"/>
+          <w:sz w:val="20"/>
+          <w:shd w:fill="EEF5FC"/>
+        </w:rPr>
+        <w:t>Name</w:t>
+      </w:r>
+      <w:r>
+        <w:rPr>
+          <w:rFonts w:ascii="Arial" w:hAnsi="Arial"/>
+          <w:b w:val="0"/>
+          <w:color w:val="15202B"/>
+          <w:sz w:val="21"/>
+        </w:rPr>
+        <w:t xml:space="preserve">, </w:t>
+      </w:r>
+      <w:r>
+        <w:rPr>
+          <w:rFonts w:ascii="Consolas" w:hAnsi="Consolas"/>
+          <w:b w:val="0"/>
+          <w:color w:val="0A1F44"/>
+          <w:sz w:val="20"/>
+          <w:shd w:fill="EEF5FC"/>
+        </w:rPr>
+        <w:t>Frequency</w:t>
+      </w:r>
+      <w:r>
+        <w:rPr>
+          <w:rFonts w:ascii="Arial" w:hAnsi="Arial"/>
+          <w:b w:val="0"/>
+          <w:color w:val="15202B"/>
+          <w:sz w:val="21"/>
+        </w:rPr>
+        <w:t xml:space="preserve">, and </w:t>
+      </w:r>
+      <w:r>
+        <w:rPr>
+          <w:rFonts w:ascii="Consolas" w:hAnsi="Consolas"/>
+          <w:b w:val="0"/>
+          <w:color w:val="0A1F44"/>
+          <w:sz w:val="20"/>
+          <w:shd w:fill="EEF5FC"/>
+        </w:rPr>
+        <w:t>Mode</w:t>
+      </w:r>
+      <w:r>
+        <w:rPr>
+          <w:rFonts w:ascii="Arial" w:hAnsi="Arial"/>
+          <w:b w:val="0"/>
+          <w:color w:val="15202B"/>
+          <w:sz w:val="21"/>
+        </w:rPr>
+        <w:t>. The downloaded template includes the full standard CHIRP column set.</w:t>
+      </w:r>
+    </w:p>
+    <w:p>
+      <w:pPr>
+        <w:keepLines/>
+      </w:pPr>
+      <w:r>
+        <w:rPr>
+          <w:rFonts w:ascii="Arial" w:hAnsi="Arial"/>
+          <w:b w:val="0"/>
+          <w:color w:val="15202B"/>
+          <w:sz w:val="21"/>
+        </w:rPr>
+        <w:t>Import behavior:</w:t>
+      </w:r>
+    </w:p>
+    <w:p>
+      <w:pPr>
+        <w:pStyle w:val="ListBullet"/>
+      </w:pPr>
+      <w:r>
+        <w:rPr>
+          <w:rFonts w:ascii="Arial" w:hAnsi="Arial"/>
+          <w:b w:val="0"/>
+          <w:color w:val="15202B"/>
+          <w:sz w:val="21"/>
+        </w:rPr>
+        <w:t xml:space="preserve">136–174 MHz channels are assigned to VHF / </w:t>
+      </w:r>
+      <w:r>
+        <w:rPr>
+          <w:rFonts w:ascii="Consolas" w:hAnsi="Consolas"/>
+          <w:b w:val="0"/>
+          <w:color w:val="0A1F44"/>
+          <w:sz w:val="20"/>
+          <w:shd w:fill="EEF5FC"/>
+        </w:rPr>
+        <w:t>analog_2m</w:t>
+      </w:r>
+      <w:r>
+        <w:rPr>
+          <w:rFonts w:ascii="Arial" w:hAnsi="Arial"/>
+          <w:b w:val="0"/>
+          <w:color w:val="15202B"/>
+          <w:sz w:val="21"/>
+        </w:rPr>
+        <w:t xml:space="preserve"> / </w:t>
+      </w:r>
+      <w:r>
+        <w:rPr>
+          <w:rFonts w:ascii="Consolas" w:hAnsi="Consolas"/>
+          <w:b w:val="0"/>
+          <w:color w:val="0A1F44"/>
+          <w:sz w:val="20"/>
+          <w:shd w:fill="EEF5FC"/>
+        </w:rPr>
+        <w:t>&lt;VHF_SERIAL&gt;</w:t>
+      </w:r>
+      <w:r>
+        <w:rPr>
+          <w:rFonts w:ascii="Arial" w:hAnsi="Arial"/>
+          <w:b w:val="0"/>
+          <w:color w:val="15202B"/>
+          <w:sz w:val="21"/>
+        </w:rPr>
+        <w:t>.</w:t>
+      </w:r>
+    </w:p>
+    <w:p>
+      <w:pPr>
+        <w:pStyle w:val="ListBullet"/>
+      </w:pPr>
+      <w:r>
+        <w:rPr>
+          <w:rFonts w:ascii="Arial" w:hAnsi="Arial"/>
+          <w:b w:val="0"/>
+          <w:color w:val="15202B"/>
+          <w:sz w:val="21"/>
+        </w:rPr>
+        <w:t xml:space="preserve">400–520 MHz channels are assigned to UHF / </w:t>
+      </w:r>
+      <w:r>
+        <w:rPr>
+          <w:rFonts w:ascii="Consolas" w:hAnsi="Consolas"/>
+          <w:b w:val="0"/>
+          <w:color w:val="0A1F44"/>
+          <w:sz w:val="20"/>
+          <w:shd w:fill="EEF5FC"/>
+        </w:rPr>
+        <w:t>analog_70cm</w:t>
+      </w:r>
+      <w:r>
+        <w:rPr>
+          <w:rFonts w:ascii="Arial" w:hAnsi="Arial"/>
+          <w:b w:val="0"/>
+          <w:color w:val="15202B"/>
+          <w:sz w:val="21"/>
+        </w:rPr>
+        <w:t xml:space="preserve"> / </w:t>
+      </w:r>
+      <w:r>
+        <w:rPr>
+          <w:rFonts w:ascii="Consolas" w:hAnsi="Consolas"/>
+          <w:b w:val="0"/>
+          <w:color w:val="0A1F44"/>
+          <w:sz w:val="20"/>
+          <w:shd w:fill="EEF5FC"/>
+        </w:rPr>
+        <w:t>&lt;UHF_SERIAL&gt;</w:t>
+      </w:r>
+      <w:r>
+        <w:rPr>
+          <w:rFonts w:ascii="Arial" w:hAnsi="Arial"/>
+          <w:b w:val="0"/>
+          <w:color w:val="15202B"/>
+          <w:sz w:val="21"/>
+        </w:rPr>
+        <w:t>.</w:t>
+      </w:r>
+    </w:p>
+    <w:p>
+      <w:pPr>
+        <w:pStyle w:val="ListBullet"/>
+      </w:pPr>
+      <w:r>
+        <w:rPr>
+          <w:rFonts w:ascii="Consolas" w:hAnsi="Consolas"/>
+          <w:b w:val="0"/>
+          <w:color w:val="0A1F44"/>
+          <w:sz w:val="20"/>
+          <w:shd w:fill="EEF5FC"/>
+        </w:rPr>
+        <w:t>FM</w:t>
+      </w:r>
+      <w:r>
+        <w:rPr>
+          <w:rFonts w:ascii="Arial" w:hAnsi="Arial"/>
+          <w:b w:val="0"/>
+          <w:color w:val="15202B"/>
+          <w:sz w:val="21"/>
+        </w:rPr>
+        <w:t xml:space="preserve"> and </w:t>
+      </w:r>
+      <w:r>
+        <w:rPr>
+          <w:rFonts w:ascii="Consolas" w:hAnsi="Consolas"/>
+          <w:b w:val="0"/>
+          <w:color w:val="0A1F44"/>
+          <w:sz w:val="20"/>
+          <w:shd w:fill="EEF5FC"/>
+        </w:rPr>
+        <w:t>NFM</w:t>
+      </w:r>
+      <w:r>
+        <w:rPr>
+          <w:rFonts w:ascii="Arial" w:hAnsi="Arial"/>
+          <w:b w:val="0"/>
+          <w:color w:val="15202B"/>
+          <w:sz w:val="21"/>
+        </w:rPr>
+        <w:t xml:space="preserve"> are accepted and normalized for the NFM scanner path.</w:t>
+      </w:r>
+    </w:p>
+    <w:p>
+      <w:pPr>
+        <w:pStyle w:val="ListBullet"/>
+      </w:pPr>
+      <w:r>
+        <w:rPr>
+          <w:rFonts w:ascii="Consolas" w:hAnsi="Consolas"/>
+          <w:b w:val="0"/>
+          <w:color w:val="0A1F44"/>
+          <w:sz w:val="20"/>
+          <w:shd w:fill="EEF5FC"/>
+        </w:rPr>
+        <w:t>Skip</w:t>
+      </w:r>
+      <w:r>
+        <w:rPr>
+          <w:rFonts w:ascii="Arial" w:hAnsi="Arial"/>
+          <w:b w:val="0"/>
+          <w:color w:val="15202B"/>
+          <w:sz w:val="21"/>
+        </w:rPr>
+        <w:t xml:space="preserve"> values </w:t>
+      </w:r>
+      <w:r>
+        <w:rPr>
+          <w:rFonts w:ascii="Consolas" w:hAnsi="Consolas"/>
+          <w:b w:val="0"/>
+          <w:color w:val="0A1F44"/>
+          <w:sz w:val="20"/>
+          <w:shd w:fill="EEF5FC"/>
+        </w:rPr>
+        <w:t>S</w:t>
+      </w:r>
+      <w:r>
+        <w:rPr>
+          <w:rFonts w:ascii="Arial" w:hAnsi="Arial"/>
+          <w:b w:val="0"/>
+          <w:color w:val="15202B"/>
+          <w:sz w:val="21"/>
+        </w:rPr>
+        <w:t xml:space="preserve"> or </w:t>
+      </w:r>
+      <w:r>
+        <w:rPr>
+          <w:rFonts w:ascii="Consolas" w:hAnsi="Consolas"/>
+          <w:b w:val="0"/>
+          <w:color w:val="0A1F44"/>
+          <w:sz w:val="20"/>
+          <w:shd w:fill="EEF5FC"/>
+        </w:rPr>
+        <w:t>L</w:t>
+      </w:r>
+      <w:r>
+        <w:rPr>
+          <w:rFonts w:ascii="Arial" w:hAnsi="Arial"/>
+          <w:b w:val="0"/>
+          <w:color w:val="15202B"/>
+          <w:sz w:val="21"/>
+        </w:rPr>
+        <w:t xml:space="preserve"> import the row as disabled.</w:t>
+      </w:r>
+    </w:p>
+    <w:p>
+      <w:pPr>
+        <w:pStyle w:val="ListBullet"/>
+      </w:pPr>
+      <w:r>
+        <w:rPr>
+          <w:rFonts w:ascii="Arial" w:hAnsi="Arial"/>
+          <w:b w:val="0"/>
+          <w:color w:val="15202B"/>
+          <w:sz w:val="21"/>
+        </w:rPr>
+        <w:t xml:space="preserve">CHIRP </w:t>
+      </w:r>
+      <w:r>
+        <w:rPr>
+          <w:rFonts w:ascii="Consolas" w:hAnsi="Consolas"/>
+          <w:b w:val="0"/>
+          <w:color w:val="0A1F44"/>
+          <w:sz w:val="20"/>
+          <w:shd w:fill="EEF5FC"/>
+        </w:rPr>
+        <w:t>Tone</w:t>
+      </w:r>
+      <w:r>
+        <w:rPr>
+          <w:rFonts w:ascii="Arial" w:hAnsi="Arial"/>
+          <w:b w:val="0"/>
+          <w:color w:val="15202B"/>
+          <w:sz w:val="21"/>
+        </w:rPr>
+        <w:t xml:space="preserve"> by itself is transmit-only and does not enable receive gating.</w:t>
+      </w:r>
+    </w:p>
+    <w:p>
+      <w:pPr>
+        <w:pStyle w:val="ListBullet"/>
+      </w:pPr>
+      <w:r>
+        <w:rPr>
+          <w:rFonts w:ascii="Consolas" w:hAnsi="Consolas"/>
+          <w:b w:val="0"/>
+          <w:color w:val="0A1F44"/>
+          <w:sz w:val="20"/>
+          <w:shd w:fill="EEF5FC"/>
+        </w:rPr>
+        <w:t>TSQL</w:t>
+      </w:r>
+      <w:r>
+        <w:rPr>
+          <w:rFonts w:ascii="Arial" w:hAnsi="Arial"/>
+          <w:b w:val="0"/>
+          <w:color w:val="15202B"/>
+          <w:sz w:val="21"/>
+        </w:rPr>
+        <w:t xml:space="preserve">, </w:t>
+      </w:r>
+      <w:r>
+        <w:rPr>
+          <w:rFonts w:ascii="Consolas" w:hAnsi="Consolas"/>
+          <w:b w:val="0"/>
+          <w:color w:val="0A1F44"/>
+          <w:sz w:val="20"/>
+          <w:shd w:fill="EEF5FC"/>
+        </w:rPr>
+        <w:t>TSQL-R</w:t>
+      </w:r>
+      <w:r>
+        <w:rPr>
+          <w:rFonts w:ascii="Arial" w:hAnsi="Arial"/>
+          <w:b w:val="0"/>
+          <w:color w:val="15202B"/>
+          <w:sz w:val="21"/>
+        </w:rPr>
+        <w:t xml:space="preserve">, or a compatible cross mode uses </w:t>
+      </w:r>
+      <w:r>
+        <w:rPr>
+          <w:rFonts w:ascii="Consolas" w:hAnsi="Consolas"/>
+          <w:b w:val="0"/>
+          <w:color w:val="0A1F44"/>
+          <w:sz w:val="20"/>
+          <w:shd w:fill="EEF5FC"/>
+        </w:rPr>
+        <w:t>cToneFreq</w:t>
+      </w:r>
+      <w:r>
+        <w:rPr>
+          <w:rFonts w:ascii="Arial" w:hAnsi="Arial"/>
+          <w:b w:val="0"/>
+          <w:color w:val="15202B"/>
+          <w:sz w:val="21"/>
+        </w:rPr>
+        <w:t xml:space="preserve"> as a receive CTCSS gate.</w:t>
+      </w:r>
+    </w:p>
+    <w:p>
+      <w:pPr>
+        <w:pStyle w:val="ListBullet"/>
+      </w:pPr>
+      <w:r>
+        <w:rPr>
+          <w:rFonts w:ascii="Arial" w:hAnsi="Arial"/>
+          <w:b w:val="0"/>
+          <w:color w:val="15202B"/>
+          <w:sz w:val="21"/>
+        </w:rPr>
+        <w:t>A file containing only one band replaces only that band and preserves the other active band.</w:t>
+      </w:r>
+    </w:p>
+    <w:p>
+      <w:pPr>
+        <w:keepLines/>
+      </w:pPr>
+      <w:r>
+        <w:rPr>
+          <w:rFonts w:ascii="Arial" w:hAnsi="Arial"/>
+          <w:b w:val="0"/>
+          <w:color w:val="15202B"/>
+          <w:sz w:val="21"/>
+        </w:rPr>
+        <w:t xml:space="preserve">To back up a named analog profile, select it and press </w:t>
+      </w:r>
+      <w:r>
+        <w:rPr>
+          <w:rFonts w:ascii="Arial" w:hAnsi="Arial"/>
+          <w:b/>
+          <w:color w:val="15202B"/>
+          <w:sz w:val="21"/>
+        </w:rPr>
+        <w:t>Export Selected</w:t>
+      </w:r>
+      <w:r>
+        <w:rPr>
+          <w:rFonts w:ascii="Arial" w:hAnsi="Arial"/>
+          <w:b w:val="0"/>
+          <w:color w:val="15202B"/>
+          <w:sz w:val="21"/>
+        </w:rPr>
+        <w:t>.</w:t>
+      </w:r>
+    </w:p>
+    <w:p>
+      <w:pPr>
+        <w:pStyle w:val="Heading1"/>
+        <w:pBdr>
+          <w:bottom w:val="single" w:sz="8" w:space="4" w:color="00B8D9"/>
+        </w:pBdr>
+      </w:pPr>
+      <w:r>
+        <w:rPr>
+          <w:rFonts w:ascii="Arial" w:hAnsi="Arial"/>
+          <w:b/>
+          <w:color w:val="0A1F44"/>
+          <w:sz w:val="36"/>
+        </w:rPr>
+        <w:t>14. Import and export P25 CSV files</w:t>
+      </w:r>
+    </w:p>
+    <w:p>
+      <w:pPr>
+        <w:keepLines/>
+      </w:pPr>
+      <w:r>
+        <w:rPr>
+          <w:rFonts w:ascii="Arial" w:hAnsi="Arial"/>
+          <w:b w:val="0"/>
+          <w:color w:val="15202B"/>
+          <w:sz w:val="21"/>
+        </w:rPr>
+        <w:t xml:space="preserve">Use the </w:t>
+      </w:r>
+      <w:r>
+        <w:rPr>
+          <w:rFonts w:ascii="Arial" w:hAnsi="Arial"/>
+          <w:b/>
+          <w:color w:val="15202B"/>
+          <w:sz w:val="21"/>
+        </w:rPr>
+        <w:t>P25 Systems &amp; Talkgroups</w:t>
+      </w:r>
+      <w:r>
+        <w:rPr>
+          <w:rFonts w:ascii="Arial" w:hAnsi="Arial"/>
+          <w:b w:val="0"/>
+          <w:color w:val="15202B"/>
+          <w:sz w:val="21"/>
+        </w:rPr>
+        <w:t xml:space="preserve"> card on the Radio setup screen.</w:t>
+      </w:r>
+    </w:p>
+    <w:p>
+      <w:pPr>
+        <w:pStyle w:val="ListNumber"/>
+        <w:numPr>
+          <w:ilvl w:val="0"/>
+          <w:numId w:val="15"/>
+        </w:numPr>
+      </w:pPr>
+      <w:r>
+        <w:rPr>
+          <w:rFonts w:ascii="Arial" w:hAnsi="Arial"/>
+          <w:b w:val="0"/>
+          <w:color w:val="15202B"/>
+          <w:sz w:val="21"/>
+        </w:rPr>
+        <w:t xml:space="preserve">Press </w:t>
+      </w:r>
+      <w:r>
+        <w:rPr>
+          <w:rFonts w:ascii="Arial" w:hAnsi="Arial"/>
+          <w:b/>
+          <w:color w:val="15202B"/>
+          <w:sz w:val="21"/>
+        </w:rPr>
+        <w:t>Download Template</w:t>
+      </w:r>
+      <w:r>
+        <w:rPr>
+          <w:rFonts w:ascii="Arial" w:hAnsi="Arial"/>
+          <w:b w:val="0"/>
+          <w:color w:val="15202B"/>
+          <w:sz w:val="21"/>
+        </w:rPr>
+        <w:t>.</w:t>
+      </w:r>
+    </w:p>
+    <w:p>
+      <w:pPr>
+        <w:pStyle w:val="ListNumber"/>
+        <w:numPr>
+          <w:ilvl w:val="0"/>
+          <w:numId w:val="15"/>
+        </w:numPr>
+      </w:pPr>
+      <w:r>
+        <w:rPr>
+          <w:rFonts w:ascii="Arial" w:hAnsi="Arial"/>
+          <w:b w:val="0"/>
+          <w:color w:val="15202B"/>
+          <w:sz w:val="21"/>
+        </w:rPr>
+        <w:t>Enter one row per control frequency, optional voice frequency, or talkgroup.</w:t>
+      </w:r>
+    </w:p>
+    <w:p>
+      <w:pPr>
+        <w:pStyle w:val="ListNumber"/>
+        <w:numPr>
+          <w:ilvl w:val="0"/>
+          <w:numId w:val="15"/>
+        </w:numPr>
+      </w:pPr>
+      <w:r>
+        <w:rPr>
+          <w:rFonts w:ascii="Arial" w:hAnsi="Arial"/>
+          <w:b w:val="0"/>
+          <w:color w:val="15202B"/>
+          <w:sz w:val="21"/>
+        </w:rPr>
+        <w:t xml:space="preserve">Enter a </w:t>
+      </w:r>
+      <w:r>
+        <w:rPr>
+          <w:rFonts w:ascii="Arial" w:hAnsi="Arial"/>
+          <w:b/>
+          <w:color w:val="15202B"/>
+          <w:sz w:val="21"/>
+        </w:rPr>
+        <w:t>New Profile Name</w:t>
+      </w:r>
+      <w:r>
+        <w:rPr>
+          <w:rFonts w:ascii="Arial" w:hAnsi="Arial"/>
+          <w:b w:val="0"/>
+          <w:color w:val="15202B"/>
+          <w:sz w:val="21"/>
+        </w:rPr>
+        <w:t>.</w:t>
+      </w:r>
+    </w:p>
+    <w:p>
+      <w:pPr>
+        <w:pStyle w:val="ListNumber"/>
+        <w:numPr>
+          <w:ilvl w:val="0"/>
+          <w:numId w:val="15"/>
+        </w:numPr>
+      </w:pPr>
+      <w:r>
+        <w:rPr>
+          <w:rFonts w:ascii="Arial" w:hAnsi="Arial"/>
+          <w:b w:val="0"/>
+          <w:color w:val="15202B"/>
+          <w:sz w:val="21"/>
+        </w:rPr>
+        <w:t xml:space="preserve">Choose the CSV and press </w:t>
+      </w:r>
+      <w:r>
+        <w:rPr>
+          <w:rFonts w:ascii="Arial" w:hAnsi="Arial"/>
+          <w:b/>
+          <w:color w:val="15202B"/>
+          <w:sz w:val="21"/>
+        </w:rPr>
+        <w:t>Upload &amp; Save Profile</w:t>
+      </w:r>
+      <w:r>
+        <w:rPr>
+          <w:rFonts w:ascii="Arial" w:hAnsi="Arial"/>
+          <w:b w:val="0"/>
+          <w:color w:val="15202B"/>
+          <w:sz w:val="21"/>
+        </w:rPr>
+        <w:t>.</w:t>
+      </w:r>
+    </w:p>
+    <w:p>
+      <w:pPr>
+        <w:pStyle w:val="ListNumber"/>
+        <w:numPr>
+          <w:ilvl w:val="0"/>
+          <w:numId w:val="15"/>
         </w:numPr>
       </w:pPr>
       <w:r>
@@ -6822,7 +7397,36 @@
                 <w:color w:val="15202B"/>
                 <w:sz w:val="18"/>
               </w:rPr>
-              <w:t>System modulation metadata; retain the value supplied by the system profile</w:t>
+              <w:t xml:space="preserve">Modulation term shown by your frequency reference, such as </w:t>
+            </w:r>
+            <w:r>
+              <w:rPr>
+                <w:rFonts w:ascii="Consolas" w:hAnsi="Consolas"/>
+                <w:b w:val="0"/>
+                <w:color w:val="0A1F44"/>
+                <w:sz w:val="17"/>
+                <w:shd w:fill="EEF5FC"/>
+              </w:rPr>
+              <w:t>C4FM</w:t>
+            </w:r>
+            <w:r>
+              <w:rPr>
+                <w:rFonts w:ascii="Arial" w:hAnsi="Arial"/>
+                <w:b w:val="0"/>
+                <w:color w:val="15202B"/>
+                <w:sz w:val="18"/>
+              </w:rPr>
+              <w:t xml:space="preserve"> or </w:t>
+            </w:r>
+            <w:r>
+              <w:rPr>
+                <w:rFonts w:ascii="Consolas" w:hAnsi="Consolas"/>
+                <w:b w:val="0"/>
+                <w:color w:val="0A1F44"/>
+                <w:sz w:val="17"/>
+                <w:shd w:fill="EEF5FC"/>
+              </w:rPr>
+              <w:t>CQPSK</w:t>
             </w:r>
           </w:p>
         </w:tc>
@@ -6891,7 +7495,64 @@
                 <w:color w:val="15202B"/>
                 <w:sz w:val="18"/>
               </w:rPr>
-              <w:t xml:space="preserve"> OP25 control-channel demodulator. Use </w:t>
+              <w:t xml:space="preserve"> Control-channel modulation term shown by your reference. Enter </w:t>
+            </w:r>
+            <w:r>
+              <w:rPr>
+                <w:rFonts w:ascii="Consolas" w:hAnsi="Consolas"/>
+                <w:b w:val="0"/>
+                <w:color w:val="0A1F44"/>
+                <w:sz w:val="17"/>
+                <w:shd w:fill="EEF5FC"/>
+              </w:rPr>
+              <w:t>C4FM</w:t>
+            </w:r>
+            <w:r>
+              <w:rPr>
+                <w:rFonts w:ascii="Arial" w:hAnsi="Arial"/>
+                <w:b w:val="0"/>
+                <w:color w:val="15202B"/>
+                <w:sz w:val="18"/>
+              </w:rPr>
+              <w:t xml:space="preserve">, </w:t>
+            </w:r>
+            <w:r>
+              <w:rPr>
+                <w:rFonts w:ascii="Consolas" w:hAnsi="Consolas"/>
+                <w:b w:val="0"/>
+                <w:color w:val="0A1F44"/>
+                <w:sz w:val="17"/>
+                <w:shd w:fill="EEF5FC"/>
+              </w:rPr>
+              <w:t>4FSK</w:t>
+            </w:r>
+            <w:r>
+              <w:rPr>
+                <w:rFonts w:ascii="Arial" w:hAnsi="Arial"/>
+                <w:b w:val="0"/>
+                <w:color w:val="15202B"/>
+                <w:sz w:val="18"/>
+              </w:rPr>
+              <w:t xml:space="preserve">, or </w:t>
+            </w:r>
+            <w:r>
+              <w:rPr>
+                <w:rFonts w:ascii="Consolas" w:hAnsi="Consolas"/>
+                <w:b w:val="0"/>
+                <w:color w:val="0A1F44"/>
+                <w:sz w:val="17"/>
+                <w:shd w:fill="EEF5FC"/>
+              </w:rPr>
+              <w:t>CQPSK</w:t>
+            </w:r>
+            <w:r>
+              <w:rPr>
+                <w:rFonts w:ascii="Arial" w:hAnsi="Arial"/>
+                <w:b w:val="0"/>
+                <w:color w:val="15202B"/>
+                <w:sz w:val="18"/>
+              </w:rPr>
+              <w:t xml:space="preserve">; N0JCG Scanner translates these to OP25's internal </w:t>
             </w:r>
             <w:r>
               <w:rPr>
@@ -6910,7 +7571,26 @@
                 <w:color w:val="15202B"/>
                 <w:sz w:val="18"/>
               </w:rPr>
-              <w:t xml:space="preserve"> for Colorado DTRS C4FM control channels.</w:t>
+              <w:t xml:space="preserve"> or </w:t>
+            </w:r>
+            <w:r>
+              <w:rPr>
+                <w:rFonts w:ascii="Consolas" w:hAnsi="Consolas"/>
+                <w:b w:val="0"/>
+                <w:color w:val="0A1F44"/>
+                <w:sz w:val="17"/>
+                <w:shd w:fill="EEF5FC"/>
+              </w:rPr>
+              <w:t>cqpsk</w:t>
+            </w:r>
+            <w:r>
+              <w:rPr>
+                <w:rFonts w:ascii="Arial" w:hAnsi="Arial"/>
+                <w:b w:val="0"/>
+                <w:color w:val="15202B"/>
+                <w:sz w:val="18"/>
+              </w:rPr>
+              <w:t xml:space="preserve"> values.</w:t>
             </w:r>
           </w:p>
         </w:tc>
@@ -6951,7 +7631,7 @@
           <w:color w:val="15202B"/>
           <w:sz w:val="21"/>
         </w:rPr>
-        <w:t xml:space="preserve">; this value controls the control-channel demodulator used by OP25. For Colorado DTRS, set </w:t>
+        <w:t xml:space="preserve">; this value controls the control-channel demodulator used by OP25. Use the modulation term published by your system reference. </w:t>
       </w:r>
       <w:r>
         <w:rPr>
@@ -6961,16 +7641,16 @@
           <w:sz w:val="20"/>
           <w:shd w:fill="EEF5FC"/>
         </w:rPr>
-        <w:t>control_demod_type</w:t>
-      </w:r>
-      <w:r>
-        <w:rPr>
-          <w:rFonts w:ascii="Arial" w:hAnsi="Arial"/>
-          <w:b w:val="0"/>
-          <w:color w:val="15202B"/>
-          <w:sz w:val="21"/>
-        </w:rPr>
-        <w:t xml:space="preserve"> to </w:t>
+        <w:t>C4FM</w:t>
+      </w:r>
+      <w:r>
+        <w:rPr>
+          <w:rFonts w:ascii="Arial" w:hAnsi="Arial"/>
+          <w:b w:val="0"/>
+          <w:color w:val="15202B"/>
+          <w:sz w:val="21"/>
+        </w:rPr>
+        <w:t xml:space="preserve"> and </w:t>
       </w:r>
       <w:r>
         <w:rPr>
@@ -6980,6 +7660,25 @@
           <w:sz w:val="20"/>
           <w:shd w:fill="EEF5FC"/>
         </w:rPr>
+        <w:t>4FSK</w:t>
+      </w:r>
+      <w:r>
+        <w:rPr>
+          <w:rFonts w:ascii="Arial" w:hAnsi="Arial"/>
+          <w:b w:val="0"/>
+          <w:color w:val="15202B"/>
+          <w:sz w:val="21"/>
+        </w:rPr>
+        <w:t xml:space="preserve"> are translated to OP25's </w:t>
+      </w:r>
+      <w:r>
+        <w:rPr>
+          <w:rFonts w:ascii="Consolas" w:hAnsi="Consolas"/>
+          <w:b w:val="0"/>
+          <w:color w:val="0A1F44"/>
+          <w:sz w:val="20"/>
+          <w:shd w:fill="EEF5FC"/>
+        </w:rPr>
         <w:t>fsk4</w:t>
       </w:r>
       <w:r>
@@ -6989,7 +7688,64 @@
           <w:color w:val="15202B"/>
           <w:sz w:val="21"/>
         </w:rPr>
-        <w:t>. Do not rely on the legacy runtime marker or an environment override to select the control demodulator. Talkgroup IDs must be unique within the system and range from 0 through 65535. N0JCG Scanner does not decode encrypted traffic even if an encrypted talkgroup is present in a CSV.</w:t>
+        <w:t xml:space="preserve">, while </w:t>
+      </w:r>
+      <w:r>
+        <w:rPr>
+          <w:rFonts w:ascii="Consolas" w:hAnsi="Consolas"/>
+          <w:b w:val="0"/>
+          <w:color w:val="0A1F44"/>
+          <w:sz w:val="20"/>
+          <w:shd w:fill="EEF5FC"/>
+        </w:rPr>
+        <w:t>CQPSK</w:t>
+      </w:r>
+      <w:r>
+        <w:rPr>
+          <w:rFonts w:ascii="Arial" w:hAnsi="Arial"/>
+          <w:b w:val="0"/>
+          <w:color w:val="15202B"/>
+          <w:sz w:val="21"/>
+        </w:rPr>
+        <w:t xml:space="preserve"> is translated to </w:t>
+      </w:r>
+      <w:r>
+        <w:rPr>
+          <w:rFonts w:ascii="Consolas" w:hAnsi="Consolas"/>
+          <w:b w:val="0"/>
+          <w:color w:val="0A1F44"/>
+          <w:sz w:val="20"/>
+          <w:shd w:fill="EEF5FC"/>
+        </w:rPr>
+        <w:t>cqpsk</w:t>
+      </w:r>
+      <w:r>
+        <w:rPr>
+          <w:rFonts w:ascii="Arial" w:hAnsi="Arial"/>
+          <w:b w:val="0"/>
+          <w:color w:val="15202B"/>
+          <w:sz w:val="21"/>
+        </w:rPr>
+        <w:t xml:space="preserve">. Do not rely on a legacy runtime marker or an environment override to select the control demodulator. Profiles may also define </w:t>
+      </w:r>
+      <w:r>
+        <w:rPr>
+          <w:rFonts w:ascii="Consolas" w:hAnsi="Consolas"/>
+          <w:b w:val="0"/>
+          <w:color w:val="0A1F44"/>
+          <w:sz w:val="20"/>
+          <w:shd w:fill="EEF5FC"/>
+        </w:rPr>
+        <w:t>preferred_control_channel_hz</w:t>
+      </w:r>
+      <w:r>
+        <w:rPr>
+          <w:rFonts w:ascii="Arial" w:hAnsi="Arial"/>
+          <w:b w:val="0"/>
+          <w:color w:val="15202B"/>
+          <w:sz w:val="21"/>
+        </w:rPr>
+        <w:t>. This frequency must be one of the listed control channels and is attempted first at startup. The remaining listed channels are alternates and are searched only if the preferred channel does not lock. If the field is omitted for an older profile, the first control-channel entry is treated as the preferred channel. Talkgroup IDs must be unique within the system and range from 0 through 65535. N0JCG Scanner does not decode encrypted traffic even if an encrypted talkgroup is present in a CSV.</w:t>
       </w:r>
     </w:p>
     <w:p>
@@ -7954,7 +8710,7 @@
         <w:pStyle w:val="ListNumber"/>
         <w:numPr>
           <w:ilvl w:val="0"/>
-          <w:numId w:val="14"/>
+          <w:numId w:val="16"/>
         </w:numPr>
       </w:pPr>
       <w:r>
@@ -7991,7 +8747,7 @@
         <w:pStyle w:val="ListNumber"/>
         <w:numPr>
           <w:ilvl w:val="0"/>
-          <w:numId w:val="15"/>
+          <w:numId w:val="17"/>
         </w:numPr>
       </w:pPr>
       <w:r>
@@ -8027,7 +8783,7 @@
         <w:pStyle w:val="ListNumber"/>
         <w:numPr>
           <w:ilvl w:val="0"/>
-          <w:numId w:val="15"/>
+          <w:numId w:val="17"/>
         </w:numPr>
       </w:pPr>
       <w:r>
@@ -8045,7 +8801,7 @@
         <w:pStyle w:val="ListNumber"/>
         <w:numPr>
           <w:ilvl w:val="0"/>
-          <w:numId w:val="15"/>
+          <w:numId w:val="17"/>
         </w:numPr>
       </w:pPr>
       <w:r>
@@ -11698,6 +12454,18 @@
     </w:lvlOverride>
   </w:num>
   <w:num w:numId="15">
+    <w:abstractNumId w:val="7"/>
+    <w:lvlOverride w:ilvl="0">
+      <w:startOverride w:val="1"/>
+    </w:lvlOverride>
+  </w:num>
+  <w:num w:numId="16">
+    <w:abstractNumId w:val="7"/>
+    <w:lvlOverride w:ilvl="0">
+      <w:startOverride w:val="1"/>
+    </w:lvlOverride>
+  </w:num>
+  <w:num w:numId="17">
     <w:abstractNumId w:val="7"/>
     <w:lvlOverride w:ilvl="0">
       <w:startOverride w:val="2"/>

</xml_diff>

<commit_message>
Update manual with dark dashboard screenshot
</commit_message>
<xml_diff>
--- a/docs/publications/N0JCG_Scanner_User_Manual.docx
+++ b/docs/publications/N0JCG_Scanner_User_Manual.docx
@@ -4444,6 +4444,72 @@
           <w:sz w:val="36"/>
         </w:rPr>
         <w:t>10. Use the Dashboard</w:t>
+      </w:r>
+    </w:p>
+    <w:p>
+      <w:pPr>
+        <w:keepLines/>
+      </w:pPr>
+      <w:r>
+        <w:rPr>
+          <w:rFonts w:ascii="Arial" w:hAnsi="Arial"/>
+          <w:b w:val="0"/>
+          <w:color w:val="15202B"/>
+          <w:sz w:val="21"/>
+        </w:rPr>
+        <w:t>The current desktop dashboard uses the N0JCG dark theme. The Control state card combines the lock state and active control frequency; the separate legacy Control frequency card is no longer shown.</w:t>
+      </w:r>
+    </w:p>
+    <w:p>
+      <w:pPr>
+        <w:jc w:val="center"/>
+      </w:pPr>
+      <w:r>
+        <w:drawing>
+          <wp:inline xmlns:a="http://schemas.openxmlformats.org/drawingml/2006/main" xmlns:pic="http://schemas.openxmlformats.org/drawingml/2006/picture">
+            <wp:extent cx="6080760" cy="4645025"/>
+            <wp:docPr id="2" name="Picture 2"/>
+            <wp:cNvGraphicFramePr>
+              <a:graphicFrameLocks noChangeAspect="1"/>
+            </wp:cNvGraphicFramePr>
+            <a:graphic>
+              <a:graphicData uri="http://schemas.openxmlformats.org/drawingml/2006/picture">
+                <pic:pic>
+                  <pic:nvPicPr>
+                    <pic:cNvPr id="0" name="scanner-dashboard-dark.png"/>
+                    <pic:cNvPicPr/>
+                  </pic:nvPicPr>
+                  <pic:blipFill>
+                    <a:blip r:embed="rId12"/>
+                    <a:stretch>
+                      <a:fillRect/>
+                    </a:stretch>
+                  </pic:blipFill>
+                  <pic:spPr>
+                    <a:xfrm>
+                      <a:off x="0" y="0"/>
+                      <a:ext cx="6080760" cy="4645025"/>
+                    </a:xfrm>
+                    <a:prstGeom prst="rect"/>
+                  </pic:spPr>
+                </pic:pic>
+              </a:graphicData>
+            </a:graphic>
+          </wp:inline>
+        </w:drawing>
+      </w:r>
+    </w:p>
+    <w:p>
+      <w:pPr>
+        <w:jc w:val="center"/>
+      </w:pPr>
+      <w:r>
+        <w:rPr>
+          <w:i/>
+          <w:color w:val="6B7785"/>
+          <w:sz w:val="18"/>
+        </w:rPr>
+        <w:t>Current N0JCG Scanner dark-theme dashboard</w:t>
       </w:r>
     </w:p>
     <w:p>

</xml_diff>

<commit_message>
Update manual with true mobile dashboard
</commit_message>
<xml_diff>
--- a/docs/publications/N0JCG_Scanner_User_Manual.docx
+++ b/docs/publications/N0JCG_Scanner_User_Manual.docx
@@ -4335,6 +4335,58 @@
     </w:p>
     <w:p>
       <w:pPr>
+        <w:jc w:val="center"/>
+      </w:pPr>
+      <w:r>
+        <w:drawing>
+          <wp:inline xmlns:a="http://schemas.openxmlformats.org/drawingml/2006/main" xmlns:pic="http://schemas.openxmlformats.org/drawingml/2006/picture">
+            <wp:extent cx="2606040" cy="5011615"/>
+            <wp:docPr id="2" name="Picture 2"/>
+            <wp:cNvGraphicFramePr>
+              <a:graphicFrameLocks noChangeAspect="1"/>
+            </wp:cNvGraphicFramePr>
+            <a:graphic>
+              <a:graphicData uri="http://schemas.openxmlformats.org/drawingml/2006/picture">
+                <pic:pic>
+                  <pic:nvPicPr>
+                    <pic:cNvPr id="0" name="scanner-mobile-dashboard-dark.png"/>
+                    <pic:cNvPicPr/>
+                  </pic:nvPicPr>
+                  <pic:blipFill>
+                    <a:blip r:embed="rId12"/>
+                    <a:stretch>
+                      <a:fillRect/>
+                    </a:stretch>
+                  </pic:blipFill>
+                  <pic:spPr>
+                    <a:xfrm>
+                      <a:off x="0" y="0"/>
+                      <a:ext cx="2606040" cy="5011615"/>
+                    </a:xfrm>
+                    <a:prstGeom prst="rect"/>
+                  </pic:spPr>
+                </pic:pic>
+              </a:graphicData>
+            </a:graphic>
+          </wp:inline>
+        </w:drawing>
+      </w:r>
+    </w:p>
+    <w:p>
+      <w:pPr>
+        <w:jc w:val="center"/>
+      </w:pPr>
+      <w:r>
+        <w:rPr>
+          <w:i/>
+          <w:color w:val="6B7785"/>
+          <w:sz w:val="18"/>
+        </w:rPr>
+        <w:t>Current N0JCG Scanner dark-theme mobile dashboard</w:t>
+      </w:r>
+    </w:p>
+    <w:p>
+      <w:pPr>
         <w:keepLines/>
       </w:pPr>
       <w:r>
@@ -4468,7 +4520,7 @@
         <w:drawing>
           <wp:inline xmlns:a="http://schemas.openxmlformats.org/drawingml/2006/main" xmlns:pic="http://schemas.openxmlformats.org/drawingml/2006/picture">
             <wp:extent cx="6080760" cy="4645025"/>
-            <wp:docPr id="2" name="Picture 2"/>
+            <wp:docPr id="3" name="Picture 3"/>
             <wp:cNvGraphicFramePr>
               <a:graphicFrameLocks noChangeAspect="1"/>
             </wp:cNvGraphicFramePr>
@@ -4480,7 +4532,7 @@
                     <pic:cNvPicPr/>
                   </pic:nvPicPr>
                   <pic:blipFill>
-                    <a:blip r:embed="rId12"/>
+                    <a:blip r:embed="rId13"/>
                     <a:stretch>
                       <a:fillRect/>
                     </a:stretch>

</xml_diff>

<commit_message>
Finalize N0JCG Scanner v4.2.7 runtime and guide
</commit_message>
<xml_diff>
--- a/docs/publications/N0JCG_Scanner_User_Manual.docx
+++ b/docs/publications/N0JCG_Scanner_User_Manual.docx
@@ -187,7 +187,7 @@
                 <w:color w:val="0A1F44"/>
                 <w:sz w:val="21"/>
               </w:rPr>
-              <w:t>4.1.0</w:t>
+              <w:t>4.2.7</w:t>
             </w:r>
           </w:p>
         </w:tc>
@@ -676,7 +676,7 @@
           <w:color w:val="15202B"/>
           <w:sz w:val="21"/>
         </w:rPr>
-        <w:t>This manual covers the N0JCG Scanner v4.2.0 production layout: P25 trunked radio, FFT-directed VHF and UHF analog scanning, unified browser audio, radio profiles, and four dedicated RTL-SDR receiver assignments. It is written for both initial installation and normal daily operation.</w:t>
+        <w:t>This manual covers the N0JCG Scanner v4.2.7 production layout: P25 trunked radio, FFT-directed VHF and UHF analog scanning, unified browser audio, radio profiles, and four dedicated RTL-SDR receiver assignments. It is written for both initial installation and normal daily operation.</w:t>
       </w:r>
     </w:p>
     <w:p>
@@ -8347,6 +8347,73 @@
           <w:color w:val="15202B"/>
           <w:sz w:val="21"/>
         </w:rPr>
+        <w:t>The P25 decoder is owned by the radio service, while its event log is followed continuously by the backend. A routine backend restart therefore reconnects to the already-running decoder instead of launching a second OP25 process or dropping an active call. Verify that the decoder remains present after a backend-only restart:</w:t>
+      </w:r>
+    </w:p>
+    <w:p>
+      <w:pPr>
+        <w:keepLines/>
+        <w:spacing w:before="60" w:after="160" w:line="240" w:lineRule="auto"/>
+        <w:ind w:left="173" w:right="173"/>
+        <w:shd w:fill="EEF2F6"/>
+        <w:pBdr>
+          <w:left w:val="single" w:sz="10" w:space="7" w:color="1565C0"/>
+        </w:pBdr>
+      </w:pPr>
+      <w:r>
+        <w:rPr>
+          <w:rFonts w:ascii="Consolas" w:hAnsi="Consolas"/>
+          <w:color w:val="2B3440"/>
+          <w:sz w:val="16"/>
+        </w:rPr>
+        <w:t>pgrep -af p25_multi_rx_sticky_launcher.py</w:t>
+        <w:br/>
+        <w:t>journalctl -u pi-p25-scanner.service -n 80 --no-pager</w:t>
+      </w:r>
+    </w:p>
+    <w:p>
+      <w:pPr>
+        <w:keepLines/>
+      </w:pPr>
+      <w:r>
+        <w:rPr>
+          <w:rFonts w:ascii="Arial" w:hAnsi="Arial"/>
+          <w:b w:val="0"/>
+          <w:color w:val="15202B"/>
+          <w:sz w:val="21"/>
+        </w:rPr>
+        <w:t xml:space="preserve">Use the dashboard </w:t>
+      </w:r>
+      <w:r>
+        <w:rPr>
+          <w:rFonts w:ascii="Arial" w:hAnsi="Arial"/>
+          <w:b/>
+          <w:color w:val="15202B"/>
+          <w:sz w:val="21"/>
+        </w:rPr>
+        <w:t>Stop</w:t>
+      </w:r>
+      <w:r>
+        <w:rPr>
+          <w:rFonts w:ascii="Arial" w:hAnsi="Arial"/>
+          <w:b w:val="0"/>
+          <w:color w:val="15202B"/>
+          <w:sz w:val="21"/>
+        </w:rPr>
+        <w:t xml:space="preserve"> control when you intend to stop radio reception. Do not use a backend restart as a substitute for Stop; the persistent decoder handoff is specifically designed to keep the radio path alive during service maintenance.</w:t>
+      </w:r>
+    </w:p>
+    <w:p>
+      <w:pPr>
+        <w:keepLines/>
+      </w:pPr>
+      <w:r>
+        <w:rPr>
+          <w:rFonts w:ascii="Arial" w:hAnsi="Arial"/>
+          <w:b w:val="0"/>
+          <w:color w:val="15202B"/>
+          <w:sz w:val="21"/>
+        </w:rPr>
         <w:t>Interpret the results according to the dashboard state:</w:t>
       </w:r>
     </w:p>
@@ -12305,7 +12372,7 @@
         <w:color w:val="6B7785"/>
         <w:sz w:val="17"/>
       </w:rPr>
-      <w:t xml:space="preserve">N0JCG Open Radio Platform  |  N0JCG Scanner v4.1.0        </w:t>
+      <w:t xml:space="preserve">N0JCG Open Radio Platform  |  N0JCG Scanner v4.2.7        </w:t>
     </w:r>
     <w:r>
       <w:rPr>

</xml_diff>